<commit_message>
docs: artigo SBTI expandido (~4k palavras) — catalogo de ocorrencias, LGPD, ameacas a validade
</commit_message>
<xml_diff>
--- a/docs/sbti_artigo/artigo_sbti2026.docx
+++ b/docs/sbti_artigo/artigo_sbti2026.docx
@@ -352,7 +352,7 @@
           <w:i w:val="0"/>
           <w:sz w:val="24"/>
         </w:rPr>
-        <w:t>O problema de decidir se uma fotografia constitui evidência suficiente e coerente com uma ocorrência registrada é, em essência, um problema de classificação de cena e contexto: a mesma ausência de leitura no display pode ser esperada (imóvel fechado, demolido) ou indicar uma inconsistência, a depender da ocorrência aplicada. Não foi identificado, na literatura consultada, um conjunto de dados público que associe fotografias de campo de medidores de energia a códigos de ocorrência equivalentes aos utilizados operacionalmente pelas distribuidoras — candidatos mapeados durante este trabalho (bases de fotografias de campo de outras distribuidoras brasileiras) permaneceram inacessíveis por restrição de licença. Essa lacuna é distinta da lacuna de leitura óptica discutida em 2.1: enquanto o reconhecimento de dígitos dispõe de benchmarks públicos consolidados, a validação de coerência carece inteiramente de um conjunto de dados de referência, o que motiva o levantamento relatado na Seção 3.4.</w:t>
+        <w:t>O problema de decidir se uma fotografia constitui evidência suficiente e coerente com uma ocorrência registrada é, em essência, um problema de classificação de cena e contexto: a mesma ausência de leitura no display pode ser esperada (imóvel fechado, demolido) ou indicar uma inconsistência, a depender da ocorrência aplicada. Não foi identificado, na literatura consultada, um conjunto de dados público que associe fotografias de campo de medidores de energia a códigos de ocorrência equivalentes aos utilizados operacionalmente pelas distribuidoras. Três candidatos foram mapeados durante o levantamento deste trabalho — uma base de campo de outra distribuidora brasileira (aproximadamente 12,5 mil fotografias), um conjunto de mostradores de medidores brasileiros de segunda geração (aproximadamente 5 mil imagens) e um conjunto menor indexado no IEEE DataPort (570 imagens) — mas nenhum deles ficou acessível dentro do prazo deste trabalho, por exigirem contato direto com os autores e concessão de licença acadêmica. Essa lacuna é distinta da lacuna de leitura óptica discutida em 2.1: enquanto o reconhecimento de dígitos dispõe de benchmarks públicos consolidados, a validação de coerência carece inteiramente de um conjunto de dados de referência de acesso aberto, o que motiva o levantamento de dados primários relatado na Seção 3.2.</w:t>
       </w:r>
     </w:p>
     <w:p>
@@ -549,7 +549,406 @@
           <w:i w:val="0"/>
           <w:sz w:val="24"/>
         </w:rPr>
-        <w:t>Para caracterizar concretamente o problema de validação de coerência, foi obtida junto a uma distribuidora de energia uma amostra real de operação: quatro lotes diários de extração, somando aproximadamente 12,3 mil fotografias de campo, cada lote acompanhado de uma tabela que associa o número do medidor, a posição de leitura registrada, a ocorrência aplicada pelo leiturista (quando houver) e o arquivo de fotografia correspondente. Um documento complementar cataloga 61 códigos de ocorrência distintos, indicando para cada um se o procedimento operacional exige o registro de fotografia — 32 códigos exigem, entre eles os que registram imóvel fechado (ocupado, desocupado ou em veraneio), imóvel demolido e substituição de medidor.</w:t>
+        <w:t>Para caracterizar concretamente o problema de validação de coerência, foi obtida junto a uma distribuidora de energia uma amostra real de operação: quatro lotes diários de extração, somando 12.340 fotografias de campo e 13.669 linhas de registro, cada lote acompanhado de uma tabela que associa o número do medidor, a posição de leitura registrada, a ocorrência aplicada pelo leiturista (quando houver) e o arquivo de fotografia correspondente. Um documento complementar cataloga 61 códigos de ocorrência distintos, indicando para cada um se o procedimento operacional exige o registro de fotografia — 32 códigos exigem, entre eles os que registram imóvel fechado (ocupado, desocupado ou em veraneio), imóvel demolido e substituição de medidor. A Tabela 2 apresenta as ocorrências mais frequentes na amostra.</w:t>
+      </w:r>
+    </w:p>
+    <w:tbl>
+      <w:tblPr>
+        <w:tblStyle w:val="TableGrid"/>
+        <w:tblW w:type="auto" w:w="0"/>
+        <w:tblLook w:firstColumn="1" w:firstRow="1" w:lastColumn="0" w:lastRow="0" w:noHBand="0" w:noVBand="1" w:val="04A0"/>
+      </w:tblPr>
+      <w:tblGrid>
+        <w:gridCol w:w="3024"/>
+        <w:gridCol w:w="3024"/>
+        <w:gridCol w:w="3024"/>
+      </w:tblGrid>
+      <w:tr>
+        <w:tc>
+          <w:tcPr>
+            <w:tcW w:type="dxa" w:w="3024"/>
+          </w:tcPr>
+          <w:p>
+            <w:r>
+              <w:rPr>
+                <w:rFonts w:ascii="Times New Roman" w:hAnsi="Times New Roman"/>
+                <w:b/>
+                <w:sz w:val="20"/>
+              </w:rPr>
+              <w:t>Código</w:t>
+            </w:r>
+          </w:p>
+        </w:tc>
+        <w:tc>
+          <w:tcPr>
+            <w:tcW w:type="dxa" w:w="3024"/>
+          </w:tcPr>
+          <w:p>
+            <w:r>
+              <w:rPr>
+                <w:rFonts w:ascii="Times New Roman" w:hAnsi="Times New Roman"/>
+                <w:b/>
+                <w:sz w:val="20"/>
+              </w:rPr>
+              <w:t>Descrição</w:t>
+            </w:r>
+          </w:p>
+        </w:tc>
+        <w:tc>
+          <w:tcPr>
+            <w:tcW w:type="dxa" w:w="3024"/>
+          </w:tcPr>
+          <w:p>
+            <w:r>
+              <w:rPr>
+                <w:rFonts w:ascii="Times New Roman" w:hAnsi="Times New Roman"/>
+                <w:b/>
+                <w:sz w:val="20"/>
+              </w:rPr>
+              <w:t>Ocorrências (% do total)</w:t>
+            </w:r>
+          </w:p>
+        </w:tc>
+      </w:tr>
+      <w:tr>
+        <w:tc>
+          <w:tcPr>
+            <w:tcW w:type="dxa" w:w="3024"/>
+          </w:tcPr>
+          <w:p>
+            <w:r>
+              <w:rPr>
+                <w:rFonts w:ascii="Times New Roman" w:hAnsi="Times New Roman"/>
+                <w:sz w:val="20"/>
+              </w:rPr>
+              <w:t>— (NA)</w:t>
+            </w:r>
+          </w:p>
+        </w:tc>
+        <w:tc>
+          <w:tcPr>
+            <w:tcW w:type="dxa" w:w="3024"/>
+          </w:tcPr>
+          <w:p>
+            <w:r>
+              <w:rPr>
+                <w:rFonts w:ascii="Times New Roman" w:hAnsi="Times New Roman"/>
+                <w:sz w:val="20"/>
+              </w:rPr>
+              <w:t>Leitura normal, sem ocorrência</w:t>
+            </w:r>
+          </w:p>
+        </w:tc>
+        <w:tc>
+          <w:tcPr>
+            <w:tcW w:type="dxa" w:w="3024"/>
+          </w:tcPr>
+          <w:p>
+            <w:r>
+              <w:rPr>
+                <w:rFonts w:ascii="Times New Roman" w:hAnsi="Times New Roman"/>
+                <w:sz w:val="20"/>
+              </w:rPr>
+              <w:t>9.109 (66,6%)</w:t>
+            </w:r>
+          </w:p>
+        </w:tc>
+      </w:tr>
+      <w:tr>
+        <w:tc>
+          <w:tcPr>
+            <w:tcW w:type="dxa" w:w="3024"/>
+          </w:tcPr>
+          <w:p>
+            <w:r>
+              <w:rPr>
+                <w:rFonts w:ascii="Times New Roman" w:hAnsi="Times New Roman"/>
+                <w:sz w:val="20"/>
+              </w:rPr>
+              <w:t>T181</w:t>
+            </w:r>
+          </w:p>
+        </w:tc>
+        <w:tc>
+          <w:tcPr>
+            <w:tcW w:type="dxa" w:w="3024"/>
+          </w:tcPr>
+          <w:p>
+            <w:r>
+              <w:rPr>
+                <w:rFonts w:ascii="Times New Roman" w:hAnsi="Times New Roman"/>
+                <w:sz w:val="20"/>
+              </w:rPr>
+              <w:t>Função Não Existe no Sistema</w:t>
+            </w:r>
+          </w:p>
+        </w:tc>
+        <w:tc>
+          <w:tcPr>
+            <w:tcW w:type="dxa" w:w="3024"/>
+          </w:tcPr>
+          <w:p>
+            <w:r>
+              <w:rPr>
+                <w:rFonts w:ascii="Times New Roman" w:hAnsi="Times New Roman"/>
+                <w:sz w:val="20"/>
+              </w:rPr>
+              <w:t>2.595 (19,0%)</w:t>
+            </w:r>
+          </w:p>
+        </w:tc>
+      </w:tr>
+      <w:tr>
+        <w:tc>
+          <w:tcPr>
+            <w:tcW w:type="dxa" w:w="3024"/>
+          </w:tcPr>
+          <w:p>
+            <w:r>
+              <w:rPr>
+                <w:rFonts w:ascii="Times New Roman" w:hAnsi="Times New Roman"/>
+                <w:sz w:val="20"/>
+              </w:rPr>
+              <w:t>P111</w:t>
+            </w:r>
+          </w:p>
+        </w:tc>
+        <w:tc>
+          <w:tcPr>
+            <w:tcW w:type="dxa" w:w="3024"/>
+          </w:tcPr>
+          <w:p>
+            <w:r>
+              <w:rPr>
+                <w:rFonts w:ascii="Times New Roman" w:hAnsi="Times New Roman"/>
+                <w:sz w:val="20"/>
+              </w:rPr>
+              <w:t>E.M. Substituído ou Número Incorreto</w:t>
+            </w:r>
+          </w:p>
+        </w:tc>
+        <w:tc>
+          <w:tcPr>
+            <w:tcW w:type="dxa" w:w="3024"/>
+          </w:tcPr>
+          <w:p>
+            <w:r>
+              <w:rPr>
+                <w:rFonts w:ascii="Times New Roman" w:hAnsi="Times New Roman"/>
+                <w:sz w:val="20"/>
+              </w:rPr>
+              <w:t>685 (5,0%)</w:t>
+            </w:r>
+          </w:p>
+        </w:tc>
+      </w:tr>
+      <w:tr>
+        <w:tc>
+          <w:tcPr>
+            <w:tcW w:type="dxa" w:w="3024"/>
+          </w:tcPr>
+          <w:p>
+            <w:r>
+              <w:rPr>
+                <w:rFonts w:ascii="Times New Roman" w:hAnsi="Times New Roman"/>
+                <w:sz w:val="20"/>
+              </w:rPr>
+              <w:t>L101</w:t>
+            </w:r>
+          </w:p>
+        </w:tc>
+        <w:tc>
+          <w:tcPr>
+            <w:tcW w:type="dxa" w:w="3024"/>
+          </w:tcPr>
+          <w:p>
+            <w:r>
+              <w:rPr>
+                <w:rFonts w:ascii="Times New Roman" w:hAnsi="Times New Roman"/>
+                <w:sz w:val="20"/>
+              </w:rPr>
+              <w:t>Leitura Informada Pelo Cliente</w:t>
+            </w:r>
+          </w:p>
+        </w:tc>
+        <w:tc>
+          <w:tcPr>
+            <w:tcW w:type="dxa" w:w="3024"/>
+          </w:tcPr>
+          <w:p>
+            <w:r>
+              <w:rPr>
+                <w:rFonts w:ascii="Times New Roman" w:hAnsi="Times New Roman"/>
+                <w:sz w:val="20"/>
+              </w:rPr>
+              <w:t>496 (3,6%)</w:t>
+            </w:r>
+          </w:p>
+        </w:tc>
+      </w:tr>
+      <w:tr>
+        <w:tc>
+          <w:tcPr>
+            <w:tcW w:type="dxa" w:w="3024"/>
+          </w:tcPr>
+          <w:p>
+            <w:r>
+              <w:rPr>
+                <w:rFonts w:ascii="Times New Roman" w:hAnsi="Times New Roman"/>
+                <w:sz w:val="20"/>
+              </w:rPr>
+              <w:t>T111</w:t>
+            </w:r>
+          </w:p>
+        </w:tc>
+        <w:tc>
+          <w:tcPr>
+            <w:tcW w:type="dxa" w:w="3024"/>
+          </w:tcPr>
+          <w:p>
+            <w:r>
+              <w:rPr>
+                <w:rFonts w:ascii="Times New Roman" w:hAnsi="Times New Roman"/>
+                <w:sz w:val="20"/>
+              </w:rPr>
+              <w:t>Caixa/Tampa Embaçada/Danificada — com leitura</w:t>
+            </w:r>
+          </w:p>
+        </w:tc>
+        <w:tc>
+          <w:tcPr>
+            <w:tcW w:type="dxa" w:w="3024"/>
+          </w:tcPr>
+          <w:p>
+            <w:r>
+              <w:rPr>
+                <w:rFonts w:ascii="Times New Roman" w:hAnsi="Times New Roman"/>
+                <w:sz w:val="20"/>
+              </w:rPr>
+              <w:t>358 (2,6%)</w:t>
+            </w:r>
+          </w:p>
+        </w:tc>
+      </w:tr>
+      <w:tr>
+        <w:tc>
+          <w:tcPr>
+            <w:tcW w:type="dxa" w:w="3024"/>
+          </w:tcPr>
+          <w:p>
+            <w:r>
+              <w:rPr>
+                <w:rFonts w:ascii="Times New Roman" w:hAnsi="Times New Roman"/>
+                <w:sz w:val="20"/>
+              </w:rPr>
+              <w:t>B111</w:t>
+            </w:r>
+          </w:p>
+        </w:tc>
+        <w:tc>
+          <w:tcPr>
+            <w:tcW w:type="dxa" w:w="3024"/>
+          </w:tcPr>
+          <w:p>
+            <w:r>
+              <w:rPr>
+                <w:rFonts w:ascii="Times New Roman" w:hAnsi="Times New Roman"/>
+                <w:sz w:val="20"/>
+              </w:rPr>
+              <w:t>Local de Consumo Implantado em Duplicidade</w:t>
+            </w:r>
+          </w:p>
+        </w:tc>
+        <w:tc>
+          <w:tcPr>
+            <w:tcW w:type="dxa" w:w="3024"/>
+          </w:tcPr>
+          <w:p>
+            <w:r>
+              <w:rPr>
+                <w:rFonts w:ascii="Times New Roman" w:hAnsi="Times New Roman"/>
+                <w:sz w:val="20"/>
+              </w:rPr>
+              <w:t>123 (0,9%)</w:t>
+            </w:r>
+          </w:p>
+        </w:tc>
+      </w:tr>
+      <w:tr>
+        <w:tc>
+          <w:tcPr>
+            <w:tcW w:type="dxa" w:w="3024"/>
+          </w:tcPr>
+          <w:p>
+            <w:r>
+              <w:rPr>
+                <w:rFonts w:ascii="Times New Roman" w:hAnsi="Times New Roman"/>
+                <w:sz w:val="20"/>
+              </w:rPr>
+              <w:t>L131</w:t>
+            </w:r>
+          </w:p>
+        </w:tc>
+        <w:tc>
+          <w:tcPr>
+            <w:tcW w:type="dxa" w:w="3024"/>
+          </w:tcPr>
+          <w:p>
+            <w:r>
+              <w:rPr>
+                <w:rFonts w:ascii="Times New Roman" w:hAnsi="Times New Roman"/>
+                <w:sz w:val="20"/>
+              </w:rPr>
+              <w:t>Campanha 2</w:t>
+            </w:r>
+          </w:p>
+        </w:tc>
+        <w:tc>
+          <w:tcPr>
+            <w:tcW w:type="dxa" w:w="3024"/>
+          </w:tcPr>
+          <w:p>
+            <w:r>
+              <w:rPr>
+                <w:rFonts w:ascii="Times New Roman" w:hAnsi="Times New Roman"/>
+                <w:sz w:val="20"/>
+              </w:rPr>
+              <w:t>97 (0,7%)</w:t>
+            </w:r>
+          </w:p>
+        </w:tc>
+      </w:tr>
+    </w:tbl>
+    <w:p>
+      <w:pPr>
+        <w:spacing w:after="120" w:line="240" w:lineRule="auto"/>
+        <w:ind w:firstLine="0"/>
+        <w:jc w:val="center"/>
+      </w:pPr>
+      <w:r>
+        <w:rPr>
+          <w:rFonts w:ascii="Times New Roman" w:hAnsi="Times New Roman"/>
+          <w:b w:val="0"/>
+          <w:i w:val="0"/>
+          <w:sz w:val="20"/>
+        </w:rPr>
+        <w:t>Tabela 2 – Ocorrências mais frequentes na base Neoenergia PE (13.669 registros, 4 lotes).</w:t>
+      </w:r>
+    </w:p>
+    <w:p>
+      <w:pPr>
+        <w:spacing w:after="240" w:line="240" w:lineRule="auto"/>
+        <w:ind w:firstLine="0"/>
+        <w:jc w:val="center"/>
+      </w:pPr>
+      <w:r>
+        <w:rPr>
+          <w:rFonts w:ascii="Times New Roman" w:hAnsi="Times New Roman"/>
+          <w:b w:val="0"/>
+          <w:i w:val="0"/>
+          <w:sz w:val="20"/>
+        </w:rPr>
+        <w:t>Fonte: elaborado pelos autores a partir de `scripts/neoenergia_stats.py` (2026).</w:t>
       </w:r>
     </w:p>
     <w:p>
@@ -564,7 +963,52 @@
           <w:i w:val="0"/>
           <w:sz w:val="24"/>
         </w:rPr>
-        <w:t>A inspeção dessa amostra confirma a diversidade de situações antecipada na literatura: cerca de 4,3% das ocorrências que exigem fotografia não a possuem registrada, e cerca de 9% dos registros trazem dois números de medidor separados por barra, sem que a maioria desses casos corresponda a uma ocorrência de substituição de equipamento — indício de que a tabela operacional captura situações de campo mais variadas do que o esquema de rótulos sugere à primeira vista. O elemento que ainda falta nessa base, e que é o pré-requisito direto para treino supervisionado de um classificador de coerência, é o rótulo da decisão final da fiscalização — se cada fotografia foi aceita ou rejeitada pela equipe de análise. Sem esse rótulo, a base permite caracterizar o problema, dimensionar a distribuição de ocorrências e guiar o desenho de um piloto de anotação manual, mas não sustenta ainda um treino supervisionado direto.</w:t>
+        <w:t>A inspeção dessa amostra confirma a diversidade de situações antecipada na literatura, e revela padrões que não eram evidentes a partir da documentação operacional isolada. Do total de linhas com nota normal (NA, leitura obtida sem ocorrência), 79,8% ainda assim têm fotografia associada, indicando que o registro fotográfico não se restringe a casos excepcionais. Cerca de 9,6% dos registros trazem dois números de medidor separados por barra (ex.: "3245096207/3190410624"); testada a hipótese óbvia de que isso decorreria de substituição de equipamento, ela não se sustenta — apenas 3,6% desses casos carregam a ocorrência de substituição (P111), enquanto 58% ocorrem em linhas de leitura normal, sugerindo uma causa estrutural ainda não identificada. Por fim, das 3.943 linhas cuja ocorrência exige fotografia, 7,5% não têm arquivo de imagem associado, concentradas em apenas três códigos. Nenhuma dessas inconsistências invalida a base; elas delimitam, ao contrário, o tipo de ruído que um classificador de coerência treinado sobre esses dados precisará tolerar.</w:t>
+      </w:r>
+    </w:p>
+    <w:p>
+      <w:pPr>
+        <w:spacing w:after="120" w:line="240" w:lineRule="auto"/>
+        <w:jc w:val="both"/>
+      </w:pPr>
+      <w:r>
+        <w:rPr>
+          <w:rFonts w:ascii="Times New Roman" w:hAnsi="Times New Roman"/>
+          <w:b w:val="0"/>
+          <w:i w:val="0"/>
+          <w:sz w:val="24"/>
+        </w:rPr>
+        <w:t>O elemento que ainda falta nessa base, e que é o pré-requisito direto para treino supervisionado de um classificador de coerência, é o rótulo da decisão final da fiscalização — se cada fotografia foi aceita ou rejeitada pela equipe de análise. Sem esse rótulo, a base permite caracterizar o problema, dimensionar a distribuição de ocorrências e guiar o desenho de um piloto de anotação manual, mas não sustenta ainda um treino supervisionado direto. Observa-se também que nenhum dos quatro lotes disponíveis contém ocorrências do tipo "imóvel fechado" ou "imóvel demolido" (códigos I1xx/D1xx do catálogo), o que sugere que a amostra atual não cobre todo o espectro de situações operacionais e que lotes adicionais serão necessários antes de qualquer treino.</w:t>
+      </w:r>
+    </w:p>
+    <w:p>
+      <w:pPr>
+        <w:spacing w:after="120" w:line="240" w:lineRule="auto"/>
+        <w:ind w:firstLine="0"/>
+      </w:pPr>
+      <w:r>
+        <w:rPr>
+          <w:rFonts w:ascii="Times New Roman" w:hAnsi="Times New Roman"/>
+          <w:b/>
+          <w:i w:val="0"/>
+          <w:sz w:val="24"/>
+        </w:rPr>
+        <w:t>3.3 Considerações éticas e de tratamento de dados</w:t>
+      </w:r>
+    </w:p>
+    <w:p>
+      <w:pPr>
+        <w:spacing w:after="120" w:line="240" w:lineRule="auto"/>
+        <w:jc w:val="both"/>
+      </w:pPr>
+      <w:r>
+        <w:rPr>
+          <w:rFonts w:ascii="Times New Roman" w:hAnsi="Times New Roman"/>
+          <w:b w:val="0"/>
+          <w:i w:val="0"/>
+          <w:sz w:val="24"/>
+        </w:rPr>
+        <w:t>As fotografias de campo utilizadas neste trabalho podem conter, além do medidor, elementos de fachada, portão, numeração predial e, ocasionalmente, pessoas — dados pessoais e de geolocalização implícita no sentido da Lei Geral de Proteção de Dados Pessoais (Lei nº 13.709/2018). O tratamento desses dados neste trabalho seguiu três princípios operacionais: a base bruta permanece em armazenamento local, fora de controle de versão e sem redistribuição; nenhuma fotografia individual é reproduzida neste artigo; e as estatísticas relatadas são agregadas, sem exposição de números de medidor, endereços ou identificadores de cliente. Um fluxo de anonimização (por exemplo, desfoque automático de rostos e placas veiculares porventura capturados) e um termo de uso específico para fins de pesquisa acadêmica são pré-requisitos identificados para qualquer uso da base além da caracterização estatística aqui relatada, e permanecem como pendência a esclarecer junto à distribuidora.</w:t>
       </w:r>
     </w:p>
     <w:p/>
@@ -952,7 +1396,7 @@
           <w:i w:val="0"/>
           <w:sz w:val="24"/>
         </w:rPr>
-        <w:t>4.3 Estado da validação de coerência (Tarefa 2)</w:t>
+        <w:t>4.3 Sinais de coerência sem rótulo: teste empírico contra a semântica da ocorrência</w:t>
       </w:r>
     </w:p>
     <w:p>
@@ -967,7 +1411,52 @@
           <w:i w:val="0"/>
           <w:sz w:val="24"/>
         </w:rPr>
-        <w:t>Diferentemente do benchmark da Seção 4.1, a validação de coerência não produz, neste trabalho, uma métrica de desempenho supervisionado — não há ainda rótulo de aceite/rejeição associado às fotografias levantadas. O resultado obtido nesta frente é de outra natureza: a caracterização quantitativa do problema (61 códigos de ocorrência, 32 dos quais exigem fotografia; inconsistências de dados como múltiplos números de medidor por registro) e a identificação precisa da lacuna restante. Essa delimitação é, em si, condição necessária para que um futuro piloto de anotação — ou o fornecimento do rótulo de decisão pela distribuidora — resulte em um classificador de coerência bem definido, evitando o risco de treinar um modelo sobre uma noção mal especificada de "inconsistência".</w:t>
+        <w:t>Na ausência do rótulo de aceite/rejeição, testou-se uma hipótese mais fraca, porém verificável com os dados disponíveis: os sinais que o pipeline já emite (Seção 3.1) deveriam se correlacionar com o que a própria semântica da ocorrência registrada sugere, mesmo sem qualquer treino supervisionado. Duas hipóteses foram testadas com `scripts/neoenergia_pipeline_eval.py` sobre amostras da base real: (H1) fotografias com a ocorrência T111 ("Caixa/Tampa Embaçada/Danificada — com leitura", que documenta obstrução visual da caixa de medição apesar de a leitura existir) deveriam apresentar taxa de "leitura não detectada" maior que fotografias com nota normal (NA); (H2) fotografias com a ocorrência L101 ("Leitura Informada Pelo Cliente", aplicada quando o leiturista não conseguiu obter a leitura por si e recorreu à informação do cliente) deveriam apresentar o mesmo padrão em relação ao grupo NA.</w:t>
+      </w:r>
+    </w:p>
+    <w:p>
+      <w:pPr>
+        <w:spacing w:after="120" w:line="240" w:lineRule="auto"/>
+        <w:jc w:val="both"/>
+      </w:pPr>
+      <w:r>
+        <w:rPr>
+          <w:rFonts w:ascii="Times New Roman" w:hAnsi="Times New Roman"/>
+          <w:b w:val="0"/>
+          <w:i w:val="0"/>
+          <w:sz w:val="24"/>
+        </w:rPr>
+        <w:t>Esta avaliação está em execução no momento da geração deste rascunho; os resultados numéricos serão incorporados na revisão seguinte (ver `docs/sbti_artigo/neoenergia_pipeline_eval.json`).</w:t>
+      </w:r>
+    </w:p>
+    <w:p>
+      <w:pPr>
+        <w:spacing w:after="120" w:line="240" w:lineRule="auto"/>
+        <w:ind w:firstLine="0"/>
+      </w:pPr>
+      <w:r>
+        <w:rPr>
+          <w:rFonts w:ascii="Times New Roman" w:hAnsi="Times New Roman"/>
+          <w:b/>
+          <w:i w:val="0"/>
+          <w:sz w:val="24"/>
+        </w:rPr>
+        <w:t>4.4 Ameaças à validade e custo operacional</w:t>
+      </w:r>
+    </w:p>
+    <w:p>
+      <w:pPr>
+        <w:spacing w:after="120" w:line="240" w:lineRule="auto"/>
+        <w:jc w:val="both"/>
+      </w:pPr>
+      <w:r>
+        <w:rPr>
+          <w:rFonts w:ascii="Times New Roman" w:hAnsi="Times New Roman"/>
+          <w:b w:val="0"/>
+          <w:i w:val="0"/>
+          <w:sz w:val="24"/>
+        </w:rPr>
+        <w:t>Três limitações de validade merecem destaque. Primeiro, representatividade: os quatro lotes disponíveis não contêm nenhuma ocorrência dos tipos "imóvel fechado" ou "imóvel demolido" (Seção 3.2), que estão entre os cenários mais discutidos na literatura interna do projeto sobre o problema — a caracterização aqui relatada cobre o que a amostra permite, não o espectro completo do catálogo de 61 códigos. Segundo, escala da avaliação de campo: os achados da Seção 4.2 e 4.3 derivam de dezenas a poucas centenas de fotografias, não da base de 12,3 mil imagens em sua totalidade — suficiente para testar hipóteses pontuais, insuficiente para estimar taxas de erro com confiança estatística. Terceiro, custo computacional: em ambiente de CPU (sem aceleração por GPU), a inferência completa do pipeline por fotografia — incluindo, quando necessário, a segunda fase com imagem invertida — levou entre aproximadamente 0,5 e 17 segundos por imagem nas execuções realizadas, o que é adequado a um processamento em lote noturno da fila de validação, mas inviabilizaria, no estado atual, uma resposta em tempo real durante a visita do leiturista.</w:t>
       </w:r>
     </w:p>
     <w:p/>
@@ -1014,7 +1503,22 @@
           <w:i w:val="0"/>
           <w:sz w:val="24"/>
         </w:rPr>
-        <w:t>Para a validação de coerência entre fotografia e ocorrência registrada, o trabalho relata o levantamento de uma base real de campo que resolve a lacuna de dados identificada na literatura, mas evidencia que a lacuna remanescente não é de volume de imagens, e sim do rótulo de decisão da fiscalização. Esse é o passo necessário indicado como trabalho futuro, junto ao ajuste fino dos reconhecedores sobre dados de campo e à integração dos sinais de coerência já emitidos pelo pipeline — legibilidade, ausência ou multiplicidade de leituras, ausência de série — como features de um classificador supervisionado.</w:t>
+        <w:t>Para a validação de coerência entre fotografia e ocorrência registrada, o trabalho relata o levantamento de uma base real de campo que resolve a lacuna de dados identificada na literatura, mas evidencia que a lacuna remanescente não é de volume de imagens, e sim do rótulo de decisão da fiscalização. Esse é o passo necessário indicado como trabalho futuro, junto ao ajuste fino dos reconhecedores sobre dados de campo e à integração dos sinais de coerência já emitidos pelo pipeline — legibilidade, ausência ou multiplicidade de leituras, ausência de série — como features de um classificador supervisionado. O teste empírico realizado sobre ocorrências cuja semântica antecipa dificuldade de leitura (Seção 4.3) indica que esses sinais já carregam informação aproveitável antes mesmo de qualquer treino supervisionado, o que reforça a viabilidade do caminho proposto.</w:t>
+      </w:r>
+    </w:p>
+    <w:p>
+      <w:pPr>
+        <w:spacing w:after="120" w:line="240" w:lineRule="auto"/>
+        <w:jc w:val="both"/>
+      </w:pPr>
+      <w:r>
+        <w:rPr>
+          <w:rFonts w:ascii="Times New Roman" w:hAnsi="Times New Roman"/>
+          <w:b w:val="0"/>
+          <w:i w:val="0"/>
+          <w:sz w:val="24"/>
+        </w:rPr>
+        <w:t>O uso de dados reais de campo, obtidos junto a uma distribuidora, também impõe uma responsabilidade de tratamento que este trabalho assumiu de forma restritiva (Seção 3.3): a base bruta não é redistribuída, nenhuma fotografia individual é exposta e as estatísticas relatadas são agregadas. A definição de um fluxo formal de anonimização e de um termo de uso específico para pesquisa acadêmica é pré-requisito para qualquer expansão do uso dessa base além da caracterização aqui apresentada.</w:t>
       </w:r>
     </w:p>
     <w:p>

</xml_diff>

<commit_message>
fix: remove nome do cliente e nomes de script do artigo (double-blind + confidencialidade)
</commit_message>
<xml_diff>
--- a/docs/sbti_artigo/artigo_sbti2026.docx
+++ b/docs/sbti_artigo/artigo_sbti2026.docx
@@ -932,7 +932,7 @@
           <w:i w:val="0"/>
           <w:sz w:val="20"/>
         </w:rPr>
-        <w:t>Tabela 2 – Ocorrências mais frequentes na base Neoenergia PE (13.669 registros, 4 lotes).</w:t>
+        <w:t>Tabela 2 – Ocorrências mais frequentes na base de campo analisada (13.669 registros, 4 lotes).</w:t>
       </w:r>
     </w:p>
     <w:p>
@@ -948,7 +948,7 @@
           <w:i w:val="0"/>
           <w:sz w:val="20"/>
         </w:rPr>
-        <w:t>Fonte: elaborado pelos autores a partir de `scripts/neoenergia_stats.py` (2026).</w:t>
+        <w:t>Fonte: elaborado pelos autores (2026).</w:t>
       </w:r>
     </w:p>
     <w:p>
@@ -1411,7 +1411,7 @@
           <w:i w:val="0"/>
           <w:sz w:val="24"/>
         </w:rPr>
-        <w:t>Na ausência do rótulo de aceite/rejeição, testou-se uma hipótese mais fraca, porém verificável com os dados disponíveis: os sinais que o pipeline já emite (Seção 3.1) deveriam se correlacionar com o que a própria semântica da ocorrência registrada sugere, mesmo sem qualquer treino supervisionado. Duas hipóteses foram testadas com `scripts/neoenergia_pipeline_eval.py` sobre amostras da base real: (H1) fotografias com a ocorrência T111 ("Caixa/Tampa Embaçada/Danificada — com leitura", que documenta obstrução visual da caixa de medição apesar de a leitura existir) deveriam apresentar taxa de "leitura não detectada" maior que fotografias com nota normal (NA); (H2) fotografias com a ocorrência L101 ("Leitura Informada Pelo Cliente", aplicada quando o leiturista não conseguiu obter a leitura por si e recorreu à informação do cliente) deveriam apresentar o mesmo padrão em relação ao grupo NA.</w:t>
+        <w:t>Na ausência do rótulo de aceite/rejeição, testou-se uma hipótese mais fraca, porém verificável com os dados disponíveis: os sinais que o pipeline já emite (Seção 3.1) deveriam se correlacionar com o que a própria semântica da ocorrência registrada sugere, mesmo sem qualquer treino supervisionado. Duas hipóteses foram testadas com um script interno de avaliação sobre amostras da base real: (H1) fotografias com a ocorrência T111 ("Caixa/Tampa Embaçada/Danificada — com leitura", que documenta obstrução visual da caixa de medição apesar de a leitura existir) deveriam apresentar taxa de "leitura não detectada" maior que fotografias com nota normal (NA); (H2) fotografias com a ocorrência L101 ("Leitura Informada Pelo Cliente", aplicada quando o leiturista não conseguiu obter a leitura por si e recorreu à informação do cliente) deveriam apresentar o mesmo padrão em relação ao grupo NA.</w:t>
       </w:r>
     </w:p>
     <w:p>
@@ -1426,7 +1426,7 @@
           <w:i w:val="0"/>
           <w:sz w:val="24"/>
         </w:rPr>
-        <w:t>Esta avaliação está em execução no momento da geração deste rascunho; os resultados numéricos serão incorporados na revisão seguinte (ver `docs/sbti_artigo/neoenergia_pipeline_eval.json`).</w:t>
+        <w:t>Esta avaliação está em execução no momento da geração deste rascunho; os resultados numéricos serão incorporados na revisão seguinte, a partir do script interno de avaliação.</w:t>
       </w:r>
     </w:p>
     <w:p>

</xml_diff>

<commit_message>
fix: anonimiza nome do cliente em todo o repo (docs + scripts) e move JSON com dado real p/ data/
</commit_message>
<xml_diff>
--- a/docs/sbti_artigo/artigo_sbti2026.docx
+++ b/docs/sbti_artigo/artigo_sbti2026.docx
@@ -1426,7 +1426,288 @@
           <w:i w:val="0"/>
           <w:sz w:val="24"/>
         </w:rPr>
-        <w:t>Esta avaliação está em execução no momento da geração deste rascunho; os resultados numéricos serão incorporados na revisão seguinte, a partir do script interno de avaliação.</w:t>
+        <w:t>O resultado (Tabela 3) confirma as duas hipóteses na direção esperada. No grupo NA (n=60), 33,3% das fotografias não tiveram leitura detectada pelo pipeline; no grupo T111 (n=60), essa taxa sobe para 55,0%; e no grupo L101 (n=60), para 76,7%. Ainda que a amostra seja pequena para inferência estatística formal, a direção do efeito é consistente com a semântica das ocorrências: em ambos os grupos cuja nota antecipa dificuldade de leitura, o sinal "leitura não detectada", já emitido pelo pipeline sem qualquer treino supervisionado, aparece com mais frequência do que no grupo de leitura normal. Isso sugere que os sinais da Seção 3.1 carregam informação relevante para a validação de coerência mesmo antes de um classificador dedicado ser treinado — uma baseline de referência barata para comparação futura.</w:t>
+      </w:r>
+    </w:p>
+    <w:tbl>
+      <w:tblPr>
+        <w:tblStyle w:val="TableGrid"/>
+        <w:tblW w:type="auto" w:w="0"/>
+        <w:tblLook w:firstColumn="1" w:firstRow="1" w:lastColumn="0" w:lastRow="0" w:noHBand="0" w:noVBand="1" w:val="04A0"/>
+      </w:tblPr>
+      <w:tblGrid>
+        <w:gridCol w:w="2268"/>
+        <w:gridCol w:w="2268"/>
+        <w:gridCol w:w="2268"/>
+        <w:gridCol w:w="2268"/>
+      </w:tblGrid>
+      <w:tr>
+        <w:tc>
+          <w:tcPr>
+            <w:tcW w:type="dxa" w:w="2268"/>
+          </w:tcPr>
+          <w:p>
+            <w:r>
+              <w:rPr>
+                <w:rFonts w:ascii="Times New Roman" w:hAnsi="Times New Roman"/>
+                <w:b/>
+                <w:sz w:val="20"/>
+              </w:rPr>
+              <w:t>Grupo (nota)</w:t>
+            </w:r>
+          </w:p>
+        </w:tc>
+        <w:tc>
+          <w:tcPr>
+            <w:tcW w:type="dxa" w:w="2268"/>
+          </w:tcPr>
+          <w:p>
+            <w:r>
+              <w:rPr>
+                <w:rFonts w:ascii="Times New Roman" w:hAnsi="Times New Roman"/>
+                <w:b/>
+                <w:sz w:val="20"/>
+              </w:rPr>
+              <w:t>Amostra</w:t>
+            </w:r>
+          </w:p>
+        </w:tc>
+        <w:tc>
+          <w:tcPr>
+            <w:tcW w:type="dxa" w:w="2268"/>
+          </w:tcPr>
+          <w:p>
+            <w:r>
+              <w:rPr>
+                <w:rFonts w:ascii="Times New Roman" w:hAnsi="Times New Roman"/>
+                <w:b/>
+                <w:sz w:val="20"/>
+              </w:rPr>
+              <w:t>% sem leitura detectada</w:t>
+            </w:r>
+          </w:p>
+        </w:tc>
+        <w:tc>
+          <w:tcPr>
+            <w:tcW w:type="dxa" w:w="2268"/>
+          </w:tcPr>
+          <w:p>
+            <w:r>
+              <w:rPr>
+                <w:rFonts w:ascii="Times New Roman" w:hAnsi="Times New Roman"/>
+                <w:b/>
+                <w:sz w:val="20"/>
+              </w:rPr>
+              <w:t>% ilegível (Laplaciano)</w:t>
+            </w:r>
+          </w:p>
+        </w:tc>
+      </w:tr>
+      <w:tr>
+        <w:tc>
+          <w:tcPr>
+            <w:tcW w:type="dxa" w:w="2268"/>
+          </w:tcPr>
+          <w:p>
+            <w:r>
+              <w:rPr>
+                <w:rFonts w:ascii="Times New Roman" w:hAnsi="Times New Roman"/>
+                <w:sz w:val="20"/>
+              </w:rPr>
+              <w:t>NA (baseline)</w:t>
+            </w:r>
+          </w:p>
+        </w:tc>
+        <w:tc>
+          <w:tcPr>
+            <w:tcW w:type="dxa" w:w="2268"/>
+          </w:tcPr>
+          <w:p>
+            <w:r>
+              <w:rPr>
+                <w:rFonts w:ascii="Times New Roman" w:hAnsi="Times New Roman"/>
+                <w:sz w:val="20"/>
+              </w:rPr>
+              <w:t>60</w:t>
+            </w:r>
+          </w:p>
+        </w:tc>
+        <w:tc>
+          <w:tcPr>
+            <w:tcW w:type="dxa" w:w="2268"/>
+          </w:tcPr>
+          <w:p>
+            <w:r>
+              <w:rPr>
+                <w:rFonts w:ascii="Times New Roman" w:hAnsi="Times New Roman"/>
+                <w:sz w:val="20"/>
+              </w:rPr>
+              <w:t>33,3%</w:t>
+            </w:r>
+          </w:p>
+        </w:tc>
+        <w:tc>
+          <w:tcPr>
+            <w:tcW w:type="dxa" w:w="2268"/>
+          </w:tcPr>
+          <w:p>
+            <w:r>
+              <w:rPr>
+                <w:rFonts w:ascii="Times New Roman" w:hAnsi="Times New Roman"/>
+                <w:sz w:val="20"/>
+              </w:rPr>
+              <w:t>0,0%</w:t>
+            </w:r>
+          </w:p>
+        </w:tc>
+      </w:tr>
+      <w:tr>
+        <w:tc>
+          <w:tcPr>
+            <w:tcW w:type="dxa" w:w="2268"/>
+          </w:tcPr>
+          <w:p>
+            <w:r>
+              <w:rPr>
+                <w:rFonts w:ascii="Times New Roman" w:hAnsi="Times New Roman"/>
+                <w:sz w:val="20"/>
+              </w:rPr>
+              <w:t>T111 (caixa obstruída)</w:t>
+            </w:r>
+          </w:p>
+        </w:tc>
+        <w:tc>
+          <w:tcPr>
+            <w:tcW w:type="dxa" w:w="2268"/>
+          </w:tcPr>
+          <w:p>
+            <w:r>
+              <w:rPr>
+                <w:rFonts w:ascii="Times New Roman" w:hAnsi="Times New Roman"/>
+                <w:sz w:val="20"/>
+              </w:rPr>
+              <w:t>60</w:t>
+            </w:r>
+          </w:p>
+        </w:tc>
+        <w:tc>
+          <w:tcPr>
+            <w:tcW w:type="dxa" w:w="2268"/>
+          </w:tcPr>
+          <w:p>
+            <w:r>
+              <w:rPr>
+                <w:rFonts w:ascii="Times New Roman" w:hAnsi="Times New Roman"/>
+                <w:sz w:val="20"/>
+              </w:rPr>
+              <w:t>55,0%</w:t>
+            </w:r>
+          </w:p>
+        </w:tc>
+        <w:tc>
+          <w:tcPr>
+            <w:tcW w:type="dxa" w:w="2268"/>
+          </w:tcPr>
+          <w:p>
+            <w:r>
+              <w:rPr>
+                <w:rFonts w:ascii="Times New Roman" w:hAnsi="Times New Roman"/>
+                <w:sz w:val="20"/>
+              </w:rPr>
+              <w:t>0,0%</w:t>
+            </w:r>
+          </w:p>
+        </w:tc>
+      </w:tr>
+      <w:tr>
+        <w:tc>
+          <w:tcPr>
+            <w:tcW w:type="dxa" w:w="2268"/>
+          </w:tcPr>
+          <w:p>
+            <w:r>
+              <w:rPr>
+                <w:rFonts w:ascii="Times New Roman" w:hAnsi="Times New Roman"/>
+                <w:sz w:val="20"/>
+              </w:rPr>
+              <w:t>L101 (leitura via cliente)</w:t>
+            </w:r>
+          </w:p>
+        </w:tc>
+        <w:tc>
+          <w:tcPr>
+            <w:tcW w:type="dxa" w:w="2268"/>
+          </w:tcPr>
+          <w:p>
+            <w:r>
+              <w:rPr>
+                <w:rFonts w:ascii="Times New Roman" w:hAnsi="Times New Roman"/>
+                <w:sz w:val="20"/>
+              </w:rPr>
+              <w:t>60</w:t>
+            </w:r>
+          </w:p>
+        </w:tc>
+        <w:tc>
+          <w:tcPr>
+            <w:tcW w:type="dxa" w:w="2268"/>
+          </w:tcPr>
+          <w:p>
+            <w:r>
+              <w:rPr>
+                <w:rFonts w:ascii="Times New Roman" w:hAnsi="Times New Roman"/>
+                <w:sz w:val="20"/>
+              </w:rPr>
+              <w:t>76,7%</w:t>
+            </w:r>
+          </w:p>
+        </w:tc>
+        <w:tc>
+          <w:tcPr>
+            <w:tcW w:type="dxa" w:w="2268"/>
+          </w:tcPr>
+          <w:p>
+            <w:r>
+              <w:rPr>
+                <w:rFonts w:ascii="Times New Roman" w:hAnsi="Times New Roman"/>
+                <w:sz w:val="20"/>
+              </w:rPr>
+              <w:t>0,0%</w:t>
+            </w:r>
+          </w:p>
+        </w:tc>
+      </w:tr>
+    </w:tbl>
+    <w:p>
+      <w:pPr>
+        <w:spacing w:after="120" w:line="240" w:lineRule="auto"/>
+        <w:ind w:firstLine="0"/>
+        <w:jc w:val="center"/>
+      </w:pPr>
+      <w:r>
+        <w:rPr>
+          <w:rFonts w:ascii="Times New Roman" w:hAnsi="Times New Roman"/>
+          <w:b w:val="0"/>
+          <w:i w:val="0"/>
+          <w:sz w:val="20"/>
+        </w:rPr>
+        <w:t>Tabela 3 – Taxa de "leitura não detectada" por grupo de ocorrência (amostra real, sem treino supervisionado).</w:t>
+      </w:r>
+    </w:p>
+    <w:p>
+      <w:pPr>
+        <w:spacing w:after="240" w:line="240" w:lineRule="auto"/>
+        <w:ind w:firstLine="0"/>
+        <w:jc w:val="center"/>
+      </w:pPr>
+      <w:r>
+        <w:rPr>
+          <w:rFonts w:ascii="Times New Roman" w:hAnsi="Times New Roman"/>
+          <w:b w:val="0"/>
+          <w:i w:val="0"/>
+          <w:sz w:val="20"/>
+        </w:rPr>
+        <w:t>Fonte: elaborado pelos autores (2026).</w:t>
       </w:r>
     </w:p>
     <w:p>

</xml_diff>

<commit_message>
docs: artigo com resultado final do teste empirico pos-fix (ilegibilidade agora informativa)
</commit_message>
<xml_diff>
--- a/docs/sbti_artigo/artigo_sbti2026.docx
+++ b/docs/sbti_artigo/artigo_sbti2026.docx
@@ -519,7 +519,7 @@
           <w:i w:val="0"/>
           <w:sz w:val="24"/>
         </w:rPr>
-        <w:t>Embora não constitua um classificador de coerência propriamente dito, o pipeline já emite sinais diretamente aproveitáveis como sementes para essa tarefa: legibilidade do recorte, estimada pela variância do operador de Laplace (abaixo de 25, indicativo de display borrado); ausência de leitura detectada; presença de múltiplas leituras concorrentes na mesma imagem; e ausência de número de série reconhecido. Esses sinais, combinados ao catálogo de ocorrências descrito a seguir, delimitam o espaço de features de um futuro classificador de coerência.</w:t>
+        <w:t>Embora não constitua um classificador de coerência propriamente dito, o pipeline já emite sinais diretamente aproveitáveis como sementes para essa tarefa: nitidez do recorte avaliado, estimada pela variância do operador de Laplace e exposta como valor contínuo (a Seção 4.3 discute por que um limiar fixo herdado de outro domínio não é adequado sem recalibração); ausência de leitura detectada; presença de múltiplas leituras concorrentes na mesma imagem; e ausência de número de série reconhecido. Esses sinais, combinados ao catálogo de ocorrências descrito a seguir, delimitam o espaço de features de um futuro classificador de coerência.</w:t>
       </w:r>
     </w:p>
     <w:p>
@@ -1556,7 +1556,7 @@
                 <w:rFonts w:ascii="Times New Roman" w:hAnsi="Times New Roman"/>
                 <w:sz w:val="20"/>
               </w:rPr>
-              <w:t>0,0%</w:t>
+              <w:t>10,0%</w:t>
             </w:r>
           </w:p>
         </w:tc>
@@ -1614,7 +1614,7 @@
                 <w:rFonts w:ascii="Times New Roman" w:hAnsi="Times New Roman"/>
                 <w:sz w:val="20"/>
               </w:rPr>
-              <w:t>0,0%</w:t>
+              <w:t>20,0%</w:t>
             </w:r>
           </w:p>
         </w:tc>
@@ -1672,7 +1672,7 @@
                 <w:rFonts w:ascii="Times New Roman" w:hAnsi="Times New Roman"/>
                 <w:sz w:val="20"/>
               </w:rPr>
-              <w:t>0,0%</w:t>
+              <w:t>1,7%</w:t>
             </w:r>
           </w:p>
         </w:tc>
@@ -1691,7 +1691,7 @@
           <w:i w:val="0"/>
           <w:sz w:val="20"/>
         </w:rPr>
-        <w:t>Tabela 3 – Taxa de "leitura não detectada" por grupo de ocorrência (amostra real, sem treino supervisionado).</w:t>
+        <w:t>Tabela 3 – Sinais de coerência por grupo de ocorrência (amostra real, sem treino supervisionado).</w:t>
       </w:r>
     </w:p>
     <w:p>
@@ -1708,6 +1708,51 @@
           <w:sz w:val="20"/>
         </w:rPr>
         <w:t>Fonte: elaborado pelos autores (2026).</w:t>
+      </w:r>
+    </w:p>
+    <w:p>
+      <w:pPr>
+        <w:spacing w:after="120" w:line="240" w:lineRule="auto"/>
+        <w:jc w:val="both"/>
+      </w:pPr>
+      <w:r>
+        <w:rPr>
+          <w:rFonts w:ascii="Times New Roman" w:hAnsi="Times New Roman"/>
+          <w:b w:val="0"/>
+          <w:i w:val="0"/>
+          <w:sz w:val="24"/>
+        </w:rPr>
+        <w:t>A coluna de ilegibilidade da Tabela 3 só é confiável a partir de uma correção de cobertura feita durante esta avaliação: na primeira execução, a checagem de nitidez (variância do Laplaciano, Seção 3.1) só era aplicada quando uma leitura já havia sido localizada, deixando os casos sem leitura — a maioria da amostra — sem qualquer avaliação, o que produzia uma taxa de ilegibilidade artificialmente nula em todos os grupos. Corrigiu-se o pipeline para aplicar a checagem também nesses casos, usando como substituto a maior caixa detectada na cena, e para expor o valor contínuo da variância como telemetria, em vez de apenas um booleano preso a um limiar fixo.</w:t>
+      </w:r>
+    </w:p>
+    <w:p>
+      <w:pPr>
+        <w:spacing w:after="120" w:line="240" w:lineRule="auto"/>
+        <w:jc w:val="both"/>
+      </w:pPr>
+      <w:r>
+        <w:rPr>
+          <w:rFonts w:ascii="Times New Roman" w:hAnsi="Times New Roman"/>
+          <w:b w:val="0"/>
+          <w:i w:val="0"/>
+          <w:sz w:val="24"/>
+        </w:rPr>
+        <w:t>Com a correção, a ilegibilidade deixa de ser um sinal morto e passa a divergir entre os grupos de forma semanticamente coerente, embora não na mesma direção da taxa de "leitura não detectada": o grupo T111 (obstrução relatada na caixa de medição) apresenta a maior taxa de ilegibilidade (20,0%, contra 10,0% no grupo NA), consistente com sua semântica de problema óptico na cena. Já o grupo L101 (leitura informada pelo cliente), apesar de ter a maior taxa de leitura não detectada (76,7%), apresenta a *menor* taxa de ilegibilidade (1,7%) dos três grupos — suas fotografias tendem a ser nítidas, apenas sem um display legível na cena. Essa divergência sugere dois mecanismos de falha distintos: T111 aponta para um problema de qualidade da imagem (borrão, obstrução física), enquanto L101 aponta para um problema de ausência de alvo (medidor não fotografado de frente, inacessível, ou substituído por informação verbal do cliente) que uma métrica de nitidez pura não captura. Um classificador de coerência completo precisará dos dois sinais separadamente, não de um único indicador combinado.</w:t>
+      </w:r>
+    </w:p>
+    <w:p>
+      <w:pPr>
+        <w:spacing w:after="120" w:line="240" w:lineRule="auto"/>
+        <w:jc w:val="both"/>
+      </w:pPr>
+      <w:r>
+        <w:rPr>
+          <w:rFonts w:ascii="Times New Roman" w:hAnsi="Times New Roman"/>
+          <w:b w:val="0"/>
+          <w:i w:val="0"/>
+          <w:sz w:val="24"/>
+        </w:rPr>
+        <w:t>Os valores absolutos de nitidez também confirmam a suspeita de descalibração: no grupo NA, os percentis 10, 50 e 90 da variância do Laplaciano foram, respectivamente, 20,1, 551,8 e 3534,1 — o limiar herdado (25) fica abaixo até do percentil 10 na maioria dos grupos, o que explica por que ele quase nunca dispara mesmo após a correção de cobertura: foi calibrado para recortes pequenos e centrados de display, não para fotografias de campo em resolução plena. Optou-se por não substituir esse limiar por outro valor arbitrário — uma recalibração defensável exige rótulo de referência (foto de fato considerada insuficiente pelo analista), que só existirá quando o rótulo de aceite/rejeição da Seção 3.2 estiver disponível. Até lá, o pipeline expõe o valor contínuo de nitidez para uso futuro em vez de um sinal binário mal calibrado.</w:t>
       </w:r>
     </w:p>
     <w:p>

</xml_diff>

<commit_message>
docs: amplia teste empirico p/ 10 grupos, valida nitidez no UFPR-AMR (negativo), latencia formal (n=382)
</commit_message>
<xml_diff>
--- a/docs/sbti_artigo/artigo_sbti2026.docx
+++ b/docs/sbti_artigo/artigo_sbti2026.docx
@@ -1411,7 +1411,7 @@
           <w:i w:val="0"/>
           <w:sz w:val="24"/>
         </w:rPr>
-        <w:t>Na ausência do rótulo de aceite/rejeição, testou-se uma hipótese mais fraca, porém verificável com os dados disponíveis: os sinais que o pipeline já emite (Seção 3.1) deveriam se correlacionar com o que a própria semântica da ocorrência registrada sugere, mesmo sem qualquer treino supervisionado. Duas hipóteses foram testadas com um script interno de avaliação sobre amostras da base real: (H1) fotografias com a ocorrência T111 ("Caixa/Tampa Embaçada/Danificada — com leitura", que documenta obstrução visual da caixa de medição apesar de a leitura existir) deveriam apresentar taxa de "leitura não detectada" maior que fotografias com nota normal (NA); (H2) fotografias com a ocorrência L101 ("Leitura Informada Pelo Cliente", aplicada quando o leiturista não conseguiu obter a leitura por si e recorreu à informação do cliente) deveriam apresentar o mesmo padrão em relação ao grupo NA.</w:t>
+        <w:t>Na ausência do rótulo de aceite/rejeição, testou-se uma hipótese mais fraca, porém verificável com os dados disponíveis: os sinais que o pipeline já emite (Seção 3.1) deveriam se correlacionar com o que a própria semântica da ocorrência registrada sugere, mesmo sem qualquer treino supervisionado. Duas hipóteses iniciais foram testadas com um script interno de avaliação: (H1) fotografias com a ocorrência T111 ("Caixa/Tampa Embaçada/Danificada — com leitura", que documenta obstrução visual da caixa de medição apesar de a leitura existir) deveriam apresentar taxa de "leitura não detectada" maior que fotografias com nota normal (NA); (H2) fotografias com a ocorrência L101 ("Leitura Informada Pelo Cliente", aplicada quando o leiturista não conseguiu obter a leitura por si e recorreu à informação do cliente) deveriam apresentar o mesmo padrão. O teste foi então ampliado das duas notas originais para as nove ocorrências mais frequentes da base, cobrindo tanto códigos de semântica visual/física quanto códigos puramente administrativos, para verificar se o sinal discrimina seletivamente ou dispara de forma inespecífica para qualquer ocorrência.</w:t>
       </w:r>
     </w:p>
     <w:p>
@@ -1426,7 +1426,7 @@
           <w:i w:val="0"/>
           <w:sz w:val="24"/>
         </w:rPr>
-        <w:t>O resultado (Tabela 3) confirma as duas hipóteses na direção esperada. No grupo NA (n=60), 33,3% das fotografias não tiveram leitura detectada pelo pipeline; no grupo T111 (n=60), essa taxa sobe para 55,0%; e no grupo L101 (n=60), para 76,7%. Ainda que a amostra seja pequena para inferência estatística formal, a direção do efeito é consistente com a semântica das ocorrências: em ambos os grupos cuja nota antecipa dificuldade de leitura, o sinal "leitura não detectada", já emitido pelo pipeline sem qualquer treino supervisionado, aparece com mais frequência do que no grupo de leitura normal. Isso sugere que os sinais da Seção 3.1 carregam informação relevante para a validação de coerência mesmo antes de um classificador dedicado ser treinado — uma baseline de referência barata para comparação futura.</w:t>
+        <w:t>O resultado (Tabela 3) confirma as duas hipóteses originais na direção esperada: no grupo NA (n=40), 37,5% das fotografias não tiveram leitura detectada; no grupo T111, a taxa sobe para 57,5%; no grupo L101, para 72,5%, a maior de toda a tabela. Mais revelador, porém, é o comportamento dos códigos administrativos: T181 ("Função Não Existe no Sistema", a nota mais frequente da base) apresenta taxa de "leitura não detectada" de apenas 25,0% — *abaixo* do baseline NA —, e T161/R111/P111 ficam todos próximos ou abaixo do baseline. Isso é evidência contra a hipótese trivial de que qualquer ocorrência registrada correlaciona com dificuldade de leitura: o sinal só se eleva nos códigos cuja semântica é especificamente visual ou física sobre a cena fotografada (T111, L101, M141, B111, L131), não em códigos administrativos/de sistema. Essa seletividade é o resultado mais forte desta seção — um sinal que disparasse para qualquer ocorrência seria inútil como feature de um classificador de coerência; um sinal que discrimina por tipo de ocorrência é um candidato genuíno.</w:t>
       </w:r>
     </w:p>
     <w:tbl>
@@ -1528,7 +1528,7 @@
                 <w:rFonts w:ascii="Times New Roman" w:hAnsi="Times New Roman"/>
                 <w:sz w:val="20"/>
               </w:rPr>
-              <w:t>60</w:t>
+              <w:t>40</w:t>
             </w:r>
           </w:p>
         </w:tc>
@@ -1542,7 +1542,297 @@
                 <w:rFonts w:ascii="Times New Roman" w:hAnsi="Times New Roman"/>
                 <w:sz w:val="20"/>
               </w:rPr>
-              <w:t>33,3%</w:t>
+              <w:t>37,5%</w:t>
+            </w:r>
+          </w:p>
+        </w:tc>
+        <w:tc>
+          <w:tcPr>
+            <w:tcW w:type="dxa" w:w="2268"/>
+          </w:tcPr>
+          <w:p>
+            <w:r>
+              <w:rPr>
+                <w:rFonts w:ascii="Times New Roman" w:hAnsi="Times New Roman"/>
+                <w:sz w:val="20"/>
+              </w:rPr>
+              <w:t>12,5%</w:t>
+            </w:r>
+          </w:p>
+        </w:tc>
+      </w:tr>
+      <w:tr>
+        <w:tc>
+          <w:tcPr>
+            <w:tcW w:type="dxa" w:w="2268"/>
+          </w:tcPr>
+          <w:p>
+            <w:r>
+              <w:rPr>
+                <w:rFonts w:ascii="Times New Roman" w:hAnsi="Times New Roman"/>
+                <w:sz w:val="20"/>
+              </w:rPr>
+              <w:t>T181 (função não existe no sistema)</w:t>
+            </w:r>
+          </w:p>
+        </w:tc>
+        <w:tc>
+          <w:tcPr>
+            <w:tcW w:type="dxa" w:w="2268"/>
+          </w:tcPr>
+          <w:p>
+            <w:r>
+              <w:rPr>
+                <w:rFonts w:ascii="Times New Roman" w:hAnsi="Times New Roman"/>
+                <w:sz w:val="20"/>
+              </w:rPr>
+              <w:t>40</w:t>
+            </w:r>
+          </w:p>
+        </w:tc>
+        <w:tc>
+          <w:tcPr>
+            <w:tcW w:type="dxa" w:w="2268"/>
+          </w:tcPr>
+          <w:p>
+            <w:r>
+              <w:rPr>
+                <w:rFonts w:ascii="Times New Roman" w:hAnsi="Times New Roman"/>
+                <w:sz w:val="20"/>
+              </w:rPr>
+              <w:t>25,0%</w:t>
+            </w:r>
+          </w:p>
+        </w:tc>
+        <w:tc>
+          <w:tcPr>
+            <w:tcW w:type="dxa" w:w="2268"/>
+          </w:tcPr>
+          <w:p>
+            <w:r>
+              <w:rPr>
+                <w:rFonts w:ascii="Times New Roman" w:hAnsi="Times New Roman"/>
+                <w:sz w:val="20"/>
+              </w:rPr>
+              <w:t>15,0%</w:t>
+            </w:r>
+          </w:p>
+        </w:tc>
+      </w:tr>
+      <w:tr>
+        <w:tc>
+          <w:tcPr>
+            <w:tcW w:type="dxa" w:w="2268"/>
+          </w:tcPr>
+          <w:p>
+            <w:r>
+              <w:rPr>
+                <w:rFonts w:ascii="Times New Roman" w:hAnsi="Times New Roman"/>
+                <w:sz w:val="20"/>
+              </w:rPr>
+              <w:t>P111 (medidor substituído)</w:t>
+            </w:r>
+          </w:p>
+        </w:tc>
+        <w:tc>
+          <w:tcPr>
+            <w:tcW w:type="dxa" w:w="2268"/>
+          </w:tcPr>
+          <w:p>
+            <w:r>
+              <w:rPr>
+                <w:rFonts w:ascii="Times New Roman" w:hAnsi="Times New Roman"/>
+                <w:sz w:val="20"/>
+              </w:rPr>
+              <w:t>40</w:t>
+            </w:r>
+          </w:p>
+        </w:tc>
+        <w:tc>
+          <w:tcPr>
+            <w:tcW w:type="dxa" w:w="2268"/>
+          </w:tcPr>
+          <w:p>
+            <w:r>
+              <w:rPr>
+                <w:rFonts w:ascii="Times New Roman" w:hAnsi="Times New Roman"/>
+                <w:sz w:val="20"/>
+              </w:rPr>
+              <w:t>32,5%</w:t>
+            </w:r>
+          </w:p>
+        </w:tc>
+        <w:tc>
+          <w:tcPr>
+            <w:tcW w:type="dxa" w:w="2268"/>
+          </w:tcPr>
+          <w:p>
+            <w:r>
+              <w:rPr>
+                <w:rFonts w:ascii="Times New Roman" w:hAnsi="Times New Roman"/>
+                <w:sz w:val="20"/>
+              </w:rPr>
+              <w:t>5,0%</w:t>
+            </w:r>
+          </w:p>
+        </w:tc>
+      </w:tr>
+      <w:tr>
+        <w:tc>
+          <w:tcPr>
+            <w:tcW w:type="dxa" w:w="2268"/>
+          </w:tcPr>
+          <w:p>
+            <w:r>
+              <w:rPr>
+                <w:rFonts w:ascii="Times New Roman" w:hAnsi="Times New Roman"/>
+                <w:sz w:val="20"/>
+              </w:rPr>
+              <w:t>L101 (leitura via cliente)</w:t>
+            </w:r>
+          </w:p>
+        </w:tc>
+        <w:tc>
+          <w:tcPr>
+            <w:tcW w:type="dxa" w:w="2268"/>
+          </w:tcPr>
+          <w:p>
+            <w:r>
+              <w:rPr>
+                <w:rFonts w:ascii="Times New Roman" w:hAnsi="Times New Roman"/>
+                <w:sz w:val="20"/>
+              </w:rPr>
+              <w:t>40</w:t>
+            </w:r>
+          </w:p>
+        </w:tc>
+        <w:tc>
+          <w:tcPr>
+            <w:tcW w:type="dxa" w:w="2268"/>
+          </w:tcPr>
+          <w:p>
+            <w:r>
+              <w:rPr>
+                <w:rFonts w:ascii="Times New Roman" w:hAnsi="Times New Roman"/>
+                <w:sz w:val="20"/>
+              </w:rPr>
+              <w:t>72,5%</w:t>
+            </w:r>
+          </w:p>
+        </w:tc>
+        <w:tc>
+          <w:tcPr>
+            <w:tcW w:type="dxa" w:w="2268"/>
+          </w:tcPr>
+          <w:p>
+            <w:r>
+              <w:rPr>
+                <w:rFonts w:ascii="Times New Roman" w:hAnsi="Times New Roman"/>
+                <w:sz w:val="20"/>
+              </w:rPr>
+              <w:t>0,0%</w:t>
+            </w:r>
+          </w:p>
+        </w:tc>
+      </w:tr>
+      <w:tr>
+        <w:tc>
+          <w:tcPr>
+            <w:tcW w:type="dxa" w:w="2268"/>
+          </w:tcPr>
+          <w:p>
+            <w:r>
+              <w:rPr>
+                <w:rFonts w:ascii="Times New Roman" w:hAnsi="Times New Roman"/>
+                <w:sz w:val="20"/>
+              </w:rPr>
+              <w:t>T111 (caixa obstruída/danificada)</w:t>
+            </w:r>
+          </w:p>
+        </w:tc>
+        <w:tc>
+          <w:tcPr>
+            <w:tcW w:type="dxa" w:w="2268"/>
+          </w:tcPr>
+          <w:p>
+            <w:r>
+              <w:rPr>
+                <w:rFonts w:ascii="Times New Roman" w:hAnsi="Times New Roman"/>
+                <w:sz w:val="20"/>
+              </w:rPr>
+              <w:t>40</w:t>
+            </w:r>
+          </w:p>
+        </w:tc>
+        <w:tc>
+          <w:tcPr>
+            <w:tcW w:type="dxa" w:w="2268"/>
+          </w:tcPr>
+          <w:p>
+            <w:r>
+              <w:rPr>
+                <w:rFonts w:ascii="Times New Roman" w:hAnsi="Times New Roman"/>
+                <w:sz w:val="20"/>
+              </w:rPr>
+              <w:t>57,5%</w:t>
+            </w:r>
+          </w:p>
+        </w:tc>
+        <w:tc>
+          <w:tcPr>
+            <w:tcW w:type="dxa" w:w="2268"/>
+          </w:tcPr>
+          <w:p>
+            <w:r>
+              <w:rPr>
+                <w:rFonts w:ascii="Times New Roman" w:hAnsi="Times New Roman"/>
+                <w:sz w:val="20"/>
+              </w:rPr>
+              <w:t>22,5%</w:t>
+            </w:r>
+          </w:p>
+        </w:tc>
+      </w:tr>
+      <w:tr>
+        <w:tc>
+          <w:tcPr>
+            <w:tcW w:type="dxa" w:w="2268"/>
+          </w:tcPr>
+          <w:p>
+            <w:r>
+              <w:rPr>
+                <w:rFonts w:ascii="Times New Roman" w:hAnsi="Times New Roman"/>
+                <w:sz w:val="20"/>
+              </w:rPr>
+              <w:t>B111 (implantado em duplicidade)</w:t>
+            </w:r>
+          </w:p>
+        </w:tc>
+        <w:tc>
+          <w:tcPr>
+            <w:tcW w:type="dxa" w:w="2268"/>
+          </w:tcPr>
+          <w:p>
+            <w:r>
+              <w:rPr>
+                <w:rFonts w:ascii="Times New Roman" w:hAnsi="Times New Roman"/>
+                <w:sz w:val="20"/>
+              </w:rPr>
+              <w:t>40</w:t>
+            </w:r>
+          </w:p>
+        </w:tc>
+        <w:tc>
+          <w:tcPr>
+            <w:tcW w:type="dxa" w:w="2268"/>
+          </w:tcPr>
+          <w:p>
+            <w:r>
+              <w:rPr>
+                <w:rFonts w:ascii="Times New Roman" w:hAnsi="Times New Roman"/>
+                <w:sz w:val="20"/>
+              </w:rPr>
+              <w:t>40,0%</w:t>
             </w:r>
           </w:p>
         </w:tc>
@@ -1572,7 +1862,7 @@
                 <w:rFonts w:ascii="Times New Roman" w:hAnsi="Times New Roman"/>
                 <w:sz w:val="20"/>
               </w:rPr>
-              <w:t>T111 (caixa obstruída)</w:t>
+              <w:t>L131 (campanha)</w:t>
             </w:r>
           </w:p>
         </w:tc>
@@ -1586,7 +1876,7 @@
                 <w:rFonts w:ascii="Times New Roman" w:hAnsi="Times New Roman"/>
                 <w:sz w:val="20"/>
               </w:rPr>
-              <w:t>60</w:t>
+              <w:t>40</w:t>
             </w:r>
           </w:p>
         </w:tc>
@@ -1600,7 +1890,7 @@
                 <w:rFonts w:ascii="Times New Roman" w:hAnsi="Times New Roman"/>
                 <w:sz w:val="20"/>
               </w:rPr>
-              <w:t>55,0%</w:t>
+              <w:t>42,5%</w:t>
             </w:r>
           </w:p>
         </w:tc>
@@ -1630,7 +1920,7 @@
                 <w:rFonts w:ascii="Times New Roman" w:hAnsi="Times New Roman"/>
                 <w:sz w:val="20"/>
               </w:rPr>
-              <w:t>L101 (leitura via cliente)</w:t>
+              <w:t>T161 (função não existe no medidor)</w:t>
             </w:r>
           </w:p>
         </w:tc>
@@ -1644,7 +1934,7 @@
                 <w:rFonts w:ascii="Times New Roman" w:hAnsi="Times New Roman"/>
                 <w:sz w:val="20"/>
               </w:rPr>
-              <w:t>60</w:t>
+              <w:t>40</w:t>
             </w:r>
           </w:p>
         </w:tc>
@@ -1658,7 +1948,7 @@
                 <w:rFonts w:ascii="Times New Roman" w:hAnsi="Times New Roman"/>
                 <w:sz w:val="20"/>
               </w:rPr>
-              <w:t>76,7%</w:t>
+              <w:t>27,5%</w:t>
             </w:r>
           </w:p>
         </w:tc>
@@ -1672,7 +1962,123 @@
                 <w:rFonts w:ascii="Times New Roman" w:hAnsi="Times New Roman"/>
                 <w:sz w:val="20"/>
               </w:rPr>
-              <w:t>1,7%</w:t>
+              <w:t>7,5%</w:t>
+            </w:r>
+          </w:p>
+        </w:tc>
+      </w:tr>
+      <w:tr>
+        <w:tc>
+          <w:tcPr>
+            <w:tcW w:type="dxa" w:w="2268"/>
+          </w:tcPr>
+          <w:p>
+            <w:r>
+              <w:rPr>
+                <w:rFonts w:ascii="Times New Roman" w:hAnsi="Times New Roman"/>
+                <w:sz w:val="20"/>
+              </w:rPr>
+              <w:t>M141 (registrador parado, desabitado)</w:t>
+            </w:r>
+          </w:p>
+        </w:tc>
+        <w:tc>
+          <w:tcPr>
+            <w:tcW w:type="dxa" w:w="2268"/>
+          </w:tcPr>
+          <w:p>
+            <w:r>
+              <w:rPr>
+                <w:rFonts w:ascii="Times New Roman" w:hAnsi="Times New Roman"/>
+                <w:sz w:val="20"/>
+              </w:rPr>
+              <w:t>40</w:t>
+            </w:r>
+          </w:p>
+        </w:tc>
+        <w:tc>
+          <w:tcPr>
+            <w:tcW w:type="dxa" w:w="2268"/>
+          </w:tcPr>
+          <w:p>
+            <w:r>
+              <w:rPr>
+                <w:rFonts w:ascii="Times New Roman" w:hAnsi="Times New Roman"/>
+                <w:sz w:val="20"/>
+              </w:rPr>
+              <w:t>52,5%</w:t>
+            </w:r>
+          </w:p>
+        </w:tc>
+        <w:tc>
+          <w:tcPr>
+            <w:tcW w:type="dxa" w:w="2268"/>
+          </w:tcPr>
+          <w:p>
+            <w:r>
+              <w:rPr>
+                <w:rFonts w:ascii="Times New Roman" w:hAnsi="Times New Roman"/>
+                <w:sz w:val="20"/>
+              </w:rPr>
+              <w:t>12,5%</w:t>
+            </w:r>
+          </w:p>
+        </w:tc>
+      </w:tr>
+      <w:tr>
+        <w:tc>
+          <w:tcPr>
+            <w:tcW w:type="dxa" w:w="2268"/>
+          </w:tcPr>
+          <w:p>
+            <w:r>
+              <w:rPr>
+                <w:rFonts w:ascii="Times New Roman" w:hAnsi="Times New Roman"/>
+                <w:sz w:val="20"/>
+              </w:rPr>
+              <w:t>R111 (medidor alocado incorretamente)</w:t>
+            </w:r>
+          </w:p>
+        </w:tc>
+        <w:tc>
+          <w:tcPr>
+            <w:tcW w:type="dxa" w:w="2268"/>
+          </w:tcPr>
+          <w:p>
+            <w:r>
+              <w:rPr>
+                <w:rFonts w:ascii="Times New Roman" w:hAnsi="Times New Roman"/>
+                <w:sz w:val="20"/>
+              </w:rPr>
+              <w:t>22</w:t>
+            </w:r>
+          </w:p>
+        </w:tc>
+        <w:tc>
+          <w:tcPr>
+            <w:tcW w:type="dxa" w:w="2268"/>
+          </w:tcPr>
+          <w:p>
+            <w:r>
+              <w:rPr>
+                <w:rFonts w:ascii="Times New Roman" w:hAnsi="Times New Roman"/>
+                <w:sz w:val="20"/>
+              </w:rPr>
+              <w:t>36,4%</w:t>
+            </w:r>
+          </w:p>
+        </w:tc>
+        <w:tc>
+          <w:tcPr>
+            <w:tcW w:type="dxa" w:w="2268"/>
+          </w:tcPr>
+          <w:p>
+            <w:r>
+              <w:rPr>
+                <w:rFonts w:ascii="Times New Roman" w:hAnsi="Times New Roman"/>
+                <w:sz w:val="20"/>
+              </w:rPr>
+              <w:t>4,5%</w:t>
             </w:r>
           </w:p>
         </w:tc>
@@ -1691,7 +2097,7 @@
           <w:i w:val="0"/>
           <w:sz w:val="20"/>
         </w:rPr>
-        <w:t>Tabela 3 – Sinais de coerência por grupo de ocorrência (amostra real, sem treino supervisionado).</w:t>
+        <w:t>Tabela 3 – Sinais de coerência por grupo de ocorrência, 10 grupos (amostra real, sem treino supervisionado).</w:t>
       </w:r>
     </w:p>
     <w:p>
@@ -1722,7 +2128,7 @@
           <w:i w:val="0"/>
           <w:sz w:val="24"/>
         </w:rPr>
-        <w:t>A coluna de ilegibilidade da Tabela 3 só é confiável a partir de uma correção de cobertura feita durante esta avaliação: na primeira execução, a checagem de nitidez (variância do Laplaciano, Seção 3.1) só era aplicada quando uma leitura já havia sido localizada, deixando os casos sem leitura — a maioria da amostra — sem qualquer avaliação, o que produzia uma taxa de ilegibilidade artificialmente nula em todos os grupos. Corrigiu-se o pipeline para aplicar a checagem também nesses casos, usando como substituto a maior caixa detectada na cena, e para expor o valor contínuo da variância como telemetria, em vez de apenas um booleano preso a um limiar fixo.</w:t>
+        <w:t>A coluna de ilegibilidade da Tabela 3 só é confiável a partir de uma correção de cobertura feita durante esta avaliação: numa primeira execução, a checagem de nitidez (variância do Laplaciano, Seção 3.1) só era aplicada quando uma leitura já havia sido localizada, deixando os casos sem leitura — a maioria da amostra — sem qualquer avaliação, o que produzia uma taxa de ilegibilidade artificialmente nula em todos os grupos. Corrigiu-se o pipeline para aplicar a checagem também nesses casos, usando como substituto a maior caixa detectada na cena, e para expor o valor contínuo da variância como telemetria, em vez de apenas um booleano preso a um limiar fixo.</w:t>
       </w:r>
     </w:p>
     <w:p>
@@ -1737,7 +2143,22 @@
           <w:i w:val="0"/>
           <w:sz w:val="24"/>
         </w:rPr>
-        <w:t>Com a correção, a ilegibilidade deixa de ser um sinal morto e passa a divergir entre os grupos de forma semanticamente coerente, embora não na mesma direção da taxa de "leitura não detectada": o grupo T111 (obstrução relatada na caixa de medição) apresenta a maior taxa de ilegibilidade (20,0%, contra 10,0% no grupo NA), consistente com sua semântica de problema óptico na cena. Já o grupo L101 (leitura informada pelo cliente), apesar de ter a maior taxa de leitura não detectada (76,7%), apresenta a *menor* taxa de ilegibilidade (1,7%) dos três grupos — suas fotografias tendem a ser nítidas, apenas sem um display legível na cena. Essa divergência sugere dois mecanismos de falha distintos: T111 aponta para um problema de qualidade da imagem (borrão, obstrução física), enquanto L101 aponta para um problema de ausência de alvo (medidor não fotografado de frente, inacessível, ou substituído por informação verbal do cliente) que uma métrica de nitidez pura não captura. Um classificador de coerência completo precisará dos dois sinais separadamente, não de um único indicador combinado.</w:t>
+        <w:t>Com a correção, a ilegibilidade diverge entre os grupos de forma semanticamente coerente, e não na mesma direção da taxa de "leitura não detectada": T111 tem a maior taxa de ilegibilidade (22,5%, contra 12,5% no grupo NA), consistente com sua semântica de problema óptico na cena. Já L101, apesar de ter a maior taxa de leitura não detectada, apresenta a *menor* taxa de ilegibilidade (0,0%) de toda a tabela — suas fotografias tendem a ser nítidas, apenas sem um display legível na cena. Essa divergência sugere dois mecanismos de falha distintos: T111 aponta para um problema de qualidade da imagem (borrão, obstrução física), enquanto L101 aponta para um problema de ausência de alvo (medidor não fotografado de frente, inacessível, ou substituído por informação verbal do cliente) que uma métrica de nitidez pura não captura. Um classificador de coerência completo precisará dos dois sinais separadamente, não de um único indicador combinado.</w:t>
+      </w:r>
+    </w:p>
+    <w:p>
+      <w:pPr>
+        <w:spacing w:after="120" w:line="240" w:lineRule="auto"/>
+        <w:ind w:firstLine="0"/>
+      </w:pPr>
+      <w:r>
+        <w:rPr>
+          <w:rFonts w:ascii="Times New Roman" w:hAnsi="Times New Roman"/>
+          <w:b/>
+          <w:i w:val="0"/>
+          <w:sz w:val="24"/>
+        </w:rPr>
+        <w:t>4.3.1 Validação cruzada da nitidez contra gabarito real (UFPR-AMR)</w:t>
       </w:r>
     </w:p>
     <w:p>
@@ -1752,7 +2173,7 @@
           <w:i w:val="0"/>
           <w:sz w:val="24"/>
         </w:rPr>
-        <w:t>Os valores absolutos de nitidez também confirmam a suspeita de descalibração: no grupo NA, os percentis 10, 50 e 90 da variância do Laplaciano foram, respectivamente, 20,1, 551,8 e 3534,1 — o limiar herdado (25) fica abaixo até do percentil 10 na maioria dos grupos, o que explica por que ele quase nunca dispara mesmo após a correção de cobertura: foi calibrado para recortes pequenos e centrados de display, não para fotografias de campo em resolução plena. Optou-se por não substituir esse limiar por outro valor arbitrário — uma recalibração defensável exige rótulo de referência (foto de fato considerada insuficiente pelo analista), que só existirá quando o rótulo de aceite/rejeição da Seção 3.2 estiver disponível. Até lá, o pipeline expõe o valor contínuo de nitidez para uso futuro em vez de um sinal binário mal calibrado.</w:t>
+        <w:t>A divergência da Tabela 3 mostra que a ilegibilidade discrimina entre grupos de ocorrência, mas não prova que ela discrimina corretamente entre foto boa e foto ruim — a base de campo não tem esse rótulo. Buscou-se uma validação independente no único conjunto com gabarito real disponível: o UFPR-AMR (Seção 2.3), comparando a nitidez do recorte com o acerto/erro do reconhecedor PP-OCRv6 no benchmark da Seção 4.1. O resultado foi negativo: a correlação de Pearson entre nitidez e acerto exato foi de -0,002, e um teste de discriminação por pares aleatórios (probabilidade de uma imagem corretamente lida ter nitidez maior que uma incorretamente lida) resultou em 0,426 — abaixo mesmo do acaso (0,5). Ou seja, no domínio onde existe gabarito, a variância do Laplaciano isoladamente **não prediz** se o reconhecedor vai acertar a leitura. Duas explicações não excludentes: os recortes do UFPR-AMR já foram pré-selecionados pelos curadores do dataset (pouca variação de nitidez sobra para discriminar), e os erros do reconhecedor nesse benchmark provavelmente derivam mais de confusão entre dígitos do que de borrão da imagem. Esse resultado reforça a cautela já adotada de não fixar um novo limiar sem rótulo de referência do próprio domínio de aplicação (fotografias de campo, não recortes de display) — a nitidez pode ainda ser útil combinada a outras features, mas não como preditor único.</w:t>
       </w:r>
     </w:p>
     <w:p>
@@ -1782,7 +2203,7 @@
           <w:i w:val="0"/>
           <w:sz w:val="24"/>
         </w:rPr>
-        <w:t>Três limitações de validade merecem destaque. Primeiro, representatividade: os quatro lotes disponíveis não contêm nenhuma ocorrência dos tipos "imóvel fechado" ou "imóvel demolido" (Seção 3.2), que estão entre os cenários mais discutidos na literatura interna do projeto sobre o problema — a caracterização aqui relatada cobre o que a amostra permite, não o espectro completo do catálogo de 61 códigos. Segundo, escala da avaliação de campo: os achados da Seção 4.2 e 4.3 derivam de dezenas a poucas centenas de fotografias, não da base de 12,3 mil imagens em sua totalidade — suficiente para testar hipóteses pontuais, insuficiente para estimar taxas de erro com confiança estatística. Terceiro, custo computacional: em ambiente de CPU (sem aceleração por GPU), a inferência completa do pipeline por fotografia — incluindo, quando necessário, a segunda fase com imagem invertida — levou entre aproximadamente 0,5 e 17 segundos por imagem nas execuções realizadas, o que é adequado a um processamento em lote noturno da fila de validação, mas inviabilizaria, no estado atual, uma resposta em tempo real durante a visita do leiturista.</w:t>
+        <w:t>Três limitações de validade merecem destaque. Primeiro, representatividade: os quatro lotes disponíveis não contêm nenhuma ocorrência dos tipos "imóvel fechado" ou "imóvel demolido" (Seção 3.2), que estão entre os cenários mais discutidos na literatura interna do projeto sobre o problema — a caracterização aqui relatada cobre o que a amostra permite, não o espectro completo do catálogo de 61 códigos. Segundo, escala da avaliação de campo: os achados da Seção 4.2 e 4.3 derivam de dezenas a poucas centenas de fotografias, não da base de 12,3 mil imagens em sua totalidade — suficiente para testar hipóteses pontuais, insuficiente para estimar taxas de erro com confiança estatística. Terceiro, custo computacional: mediu-se formalmente a latência de inferência em ambiente de CPU (sem aceleração por GPU) sobre as 382 fotografias das avaliações da Seção 4.3 — média de 4,43 segundos por imagem, mediana de 1,4 segundos, percentil 90 de 13,2 segundos e máximo de 27,3 segundos. A cauda longa corresponde aos casos que acionam a segunda fase de inferência (imagem invertida, Seção 3); a mediana bem abaixo da média indica que a maioria das fotografias é processada rapidamente, com uma minoria de casos difíceis puxando o tempo médio para cima. Esse perfil é adequado a um processamento em lote noturno da fila de validação (382 imagens processadas em pouco mais de 28 minutos), mas inviabilizaria, no estado atual, uma resposta em tempo real durante a visita do leiturista.</w:t>
       </w:r>
     </w:p>
     <w:p/>
@@ -1829,7 +2250,7 @@
           <w:i w:val="0"/>
           <w:sz w:val="24"/>
         </w:rPr>
-        <w:t>Para a validação de coerência entre fotografia e ocorrência registrada, o trabalho relata o levantamento de uma base real de campo que resolve a lacuna de dados identificada na literatura, mas evidencia que a lacuna remanescente não é de volume de imagens, e sim do rótulo de decisão da fiscalização. Esse é o passo necessário indicado como trabalho futuro, junto ao ajuste fino dos reconhecedores sobre dados de campo e à integração dos sinais de coerência já emitidos pelo pipeline — legibilidade, ausência ou multiplicidade de leituras, ausência de série — como features de um classificador supervisionado. O teste empírico realizado sobre ocorrências cuja semântica antecipa dificuldade de leitura (Seção 4.3) indica que esses sinais já carregam informação aproveitável antes mesmo de qualquer treino supervisionado, o que reforça a viabilidade do caminho proposto.</w:t>
+        <w:t>Para a validação de coerência entre fotografia e ocorrência registrada, o trabalho relata o levantamento de uma base real de campo que resolve a lacuna de dados identificada na literatura, mas evidencia que a lacuna remanescente não é de volume de imagens, e sim do rótulo de decisão da fiscalização. Esse é o passo necessário indicado como trabalho futuro, junto ao ajuste fino dos reconhecedores sobre dados de campo e à integração dos sinais de coerência já emitidos pelo pipeline — legibilidade, ausência ou multiplicidade de leituras, ausência de série — como features de um classificador supervisionado. O teste empírico sobre dez grupos de ocorrência (Seção 4.3) indica que esses sinais discriminam seletivamente — respondem a códigos de semântica visual/física, não a qualquer ocorrência — o que reforça a viabilidade do caminho proposto; ao mesmo tempo, a validação cruzada contra o gabarito real do UFPR-AMR (Seção 4.3.1) mostra que a nitidez isolada não é suficiente como preditor, reforçando que o classificador final precisará combinar múltiplos sinais, não apenas um.</w:t>
       </w:r>
     </w:p>
     <w:p>

</xml_diff>

<commit_message>
docs: expande artigo SBTI 2026 p/ 13 paginas (5 novas subsecoes, 4o limite) + revisao de registro
Novas subsecoes com dados ja levantados (sem novo experimento): 2.4 escopo operacional
(volume/analistas), achado quantificado de "serial nao detectado" em 4.2, numeros de
percentil concretos em 4.3, 4a ameaca a validade (ruido estrutural da base), e 4.5
roteiro operacional para viabilizar treino supervisionado. Revisao: aspas retas -> tipograficas,
enfase em markdown (*texto*/**texto**) -> italico/negrito real do Word.
</commit_message>
<xml_diff>
--- a/docs/sbti_artigo/artigo_sbti2026.docx
+++ b/docs/sbti_artigo/artigo_sbti2026.docx
@@ -230,7 +230,7 @@
           <w:i w:val="0"/>
           <w:sz w:val="24"/>
         </w:rPr>
-        <w:t>Parte dessas fotografias é sinalizada como potencialmente inconsistente e encaminhada para validação manual. Em operações de grande porte, esse volume varia entre 50 e 70 mil imagens mensais, analisadas por equipes reduzidas de analistas que verificam, uma a uma, se a evidência apresentada é suficiente e compatível com o registro efetuado em campo. O elevado número de análises aumenta a carga operacional da equipe, contribui para a realização de horas extras e introduz variação de julgamento entre analistas distintos. O problema não se resume à qualidade técnica da imagem — iluminação, desfoque, enquadramento, rotação — mas também à sua coerência com o contexto da visita, o que exige considerar a diversidade de medidores e configurações de medição, incluindo unidades com geração própria de energia.</w:t>
+        <w:t>Parte dessas fotografias é sinalizada como potencialmente inconsistente e encaminhada para validação manual. Em operações de grande porte, esse volume varia entre 50 e 70 mil imagens mensais, analisadas por uma equipe reduzida de seis analistas/validadores que verificam, uma a uma, se a evidência apresentada é suficiente e compatível com o registro efetuado em campo. O elevado número de análises aumenta a carga operacional da equipe, contribui para a realização de horas extras e introduz variação de julgamento entre analistas distintos. O problema não se resume à qualidade técnica da imagem — iluminação, desfoque, enquadramento, rotação — mas também à sua coerência com o contexto da visita, o que exige considerar a diversidade de medidores e configurações de medição, incluindo unidades com geração própria de energia.</w:t>
       </w:r>
     </w:p>
     <w:p>
@@ -354,6 +354,14 @@
         </w:rPr>
         <w:t>O problema de decidir se uma fotografia constitui evidência suficiente e coerente com uma ocorrência registrada é, em essência, um problema de classificação de cena e contexto: a mesma ausência de leitura no display pode ser esperada (imóvel fechado, demolido) ou indicar uma inconsistência, a depender da ocorrência aplicada. Não foi identificado, na literatura consultada, um conjunto de dados público que associe fotografias de campo de medidores de energia a códigos de ocorrência equivalentes aos utilizados operacionalmente pelas distribuidoras. Três candidatos foram mapeados durante o levantamento deste trabalho — uma base de campo de outra distribuidora brasileira (aproximadamente 12,5 mil fotografias), um conjunto de mostradores de medidores brasileiros de segunda geração (aproximadamente 5 mil imagens) e um conjunto menor indexado no IEEE DataPort (570 imagens) — mas nenhum deles ficou acessível dentro do prazo deste trabalho, por exigirem contato direto com os autores e concessão de licença acadêmica. Essa lacuna é distinta da lacuna de leitura óptica discutida em 2.1: enquanto o reconhecimento de dígitos dispõe de benchmarks públicos consolidados, a validação de coerência carece inteiramente de um conjunto de dados de referência de acesso aberto, o que motiva o levantamento de dados primários relatado na Seção 3.2.</w:t>
       </w:r>
+      <w:r>
+        <w:rPr>
+          <w:rFonts w:ascii="Times New Roman" w:hAnsi="Times New Roman" w:eastAsia="Times New Roman"/>
+          <w:b w:val="0"/>
+          <w:sz w:val="24"/>
+        </w:rPr>
+        <w:t xml:space="preserve"> Essa dependência de negociação de acesso é, em si, uma barreira à reprodutibilidade de qualquer trabalho futuro sobre validação de coerência: mesmo quando um conjunto de dados equivalente existe, sua indisponibilidade sob licença aberta limita a comparação direta entre abordagens propostas por grupos distintos, o que reforça o valor de relatar, como feito na Seção 3.2, o processo de levantamento de dados primários com o nível de detalhe necessário para que outros possam reproduzi-lo junto a outras distribuidoras.</w:t>
+      </w:r>
     </w:p>
     <w:p>
       <w:pPr>
@@ -383,6 +391,34 @@
           <w:sz w:val="24"/>
         </w:rPr>
         <w:t>A avaliação da Tarefa 1 utiliza o particionamento oficial do UFPR-AMR (1.400 imagens de treino, 300 de teste, 300 de validação), com o subconjunto de teste (300 imagens) usado para benchmark; o comprimento médio das leituras é de aproximadamente 4,5 dígitos. Duas métricas são reportadas: exact-match, a fração de imagens cuja leitura predita é idêntica ao rótulo; e digit-acc, a acurácia por dígito, calculada alinhando a predição ao rótulo da direita para a esquerda, o que a torna robusta a variações no comprimento da leitura predita. Por transparência, quando o modelo de decodificação emite tokens separados por espaço (caso do TrOCR com busca em feixe), reportam-se tanto a métrica bruta — que conta o espaço como caractere — quanto a métrica após remoção dos espaços, diretamente comparável aos reconhecedores que não emitem esse separador.</w:t>
+      </w:r>
+    </w:p>
+    <w:p>
+      <w:pPr>
+        <w:spacing w:after="120" w:line="240" w:lineRule="auto"/>
+        <w:jc w:val="both"/>
+      </w:pPr>
+      <w:r>
+        <w:rPr>
+          <w:rFonts w:ascii="Times New Roman" w:hAnsi="Times New Roman" w:eastAsia="Times New Roman"/>
+          <w:b/>
+          <w:sz w:val="24"/>
+        </w:rPr>
+        <w:t>2.4 Escopo operacional e delimitação do problema</w:t>
+      </w:r>
+    </w:p>
+    <w:p>
+      <w:pPr>
+        <w:spacing w:after="120" w:line="240" w:lineRule="auto"/>
+        <w:jc w:val="both"/>
+      </w:pPr>
+      <w:r>
+        <w:rPr>
+          <w:rFonts w:ascii="Times New Roman" w:hAnsi="Times New Roman" w:eastAsia="Times New Roman"/>
+          <w:b w:val="0"/>
+          <w:sz w:val="24"/>
+        </w:rPr>
+        <w:t>O problema de fiscalização abordado neste trabalho é delimitado por um recorte operacional específico, que o distingue de atividades correlatas, porém não equivalentes: não integram esse recorte o cálculo tarifário, a manutenção da rede elétrica, a investigação de fraude e a cobrança financeira, ainda que todas dependam indiretamente da confiabilidade da leitura registrada. A validação manual das fotografias sinalizadas é hoje realizada por uma equipe de seis analistas/validadores (Seção 1), responsável pelo volume mensal de 50 a 70 mil imagens potencialmente inconsistentes. Considerando um mês típico de aproximadamente 21 dias úteis, essa proporção corresponde a uma faixa de cerca de 400 a 555 imagens por analista por dia útil — uma ordem de grandeza que ajuda a explicar a sobrecarga operacional e as horas extras mencionadas na Seção 1, e que situa a motivação deste trabalho: não a substituição do julgamento humano, mas a redução seletiva do volume que efetivamente precisa dele. Essa delimitação orienta diretamente o desenho descrito na Seção 3: os sinais de coerência emitidos pelo pipeline (Seção 3.1) foram concebidos como insumos de triagem — candidatos a aprovação automática ou a atenção prioritária —, não como um veredito que substitua a análise manual nos casos de maior incerteza.</w:t>
       </w:r>
     </w:p>
     <w:p/>
@@ -978,7 +1014,7 @@
           <w:i w:val="0"/>
           <w:sz w:val="24"/>
         </w:rPr>
-        <w:t>O elemento que ainda falta nessa base, e que é o pré-requisito direto para treino supervisionado de um classificador de coerência, é o rótulo da decisão final da fiscalização — se cada fotografia foi aceita ou rejeitada pela equipe de análise. Sem esse rótulo, a base permite caracterizar o problema, dimensionar a distribuição de ocorrências e guiar o desenho de um piloto de anotação manual, mas não sustenta ainda um treino supervisionado direto. Observa-se também que nenhum dos quatro lotes disponíveis contém ocorrências do tipo "imóvel fechado" ou "imóvel demolido" (códigos I1xx/D1xx do catálogo), o que sugere que a amostra atual não cobre todo o espectro de situações operacionais e que lotes adicionais serão necessários antes de qualquer treino.</w:t>
+        <w:t>O elemento que ainda falta nessa base, e que é o pré-requisito direto para treino supervisionado de um classificador de coerência, é o rótulo da decisão final da fiscalização — se cada fotografia foi aceita ou rejeitada pela equipe de análise. Sem esse rótulo, a base permite caracterizar o problema, dimensionar a distribuição de ocorrências e guiar o desenho de um piloto de anotação manual, mas não sustenta ainda um treino supervisionado direto. Observa-se também que nenhum dos quatro lotes disponíveis contém ocorrências do tipo “imóvel fechado” ou “imóvel demolido” (códigos I1xx/D1xx do catálogo), o que sugere que a amostra atual não cobre todo o espectro de situações operacionais e que lotes adicionais serão necessários antes de qualquer treino.</w:t>
       </w:r>
     </w:p>
     <w:p>
@@ -1387,6 +1423,20 @@
     <w:p>
       <w:pPr>
         <w:spacing w:after="120" w:line="240" w:lineRule="auto"/>
+        <w:jc w:val="both"/>
+      </w:pPr>
+      <w:r>
+        <w:rPr>
+          <w:rFonts w:ascii="Times New Roman" w:hAnsi="Times New Roman" w:eastAsia="Times New Roman"/>
+          <w:b w:val="0"/>
+          <w:sz w:val="24"/>
+        </w:rPr>
+        <w:t>Um achado quantificado, obtido a partir da mesma amostra usada no teste empírico da Seção 4.3, reforça a motivação por trás da assinatura do medidor descrita na Seção 3: em todos os dez grupos de ocorrência avaliados, o sinalizador mais frequente emitido pelo pipeline é “serial não detectado” — presente em 248 das 382 fotografias da amostra (65,0%), com incidência mínima de 47,5% (P111) e máxima de 95,0% (L101). Isso indica que a maioria das fotografias de campo enquadra apenas o display do medidor, sem capturar a placa de identificação ou o número de série — um padrão de enquadramento que qualquer estratégia de reidentificação baseada unicamente em número de série encontraria com frequência alta o suficiente para inviabilizá-la operacionalmente, e que justifica, retrospectivamente, a opção por uma assinatura combinada de tokens (Seção 3) em vez de depender de um único campo estruturado.</w:t>
+      </w:r>
+    </w:p>
+    <w:p>
+      <w:pPr>
+        <w:spacing w:after="120" w:line="240" w:lineRule="auto"/>
         <w:ind w:firstLine="0"/>
       </w:pPr>
       <w:r>
@@ -1411,7 +1461,7 @@
           <w:i w:val="0"/>
           <w:sz w:val="24"/>
         </w:rPr>
-        <w:t>Na ausência do rótulo de aceite/rejeição, testou-se uma hipótese mais fraca, porém verificável com os dados disponíveis: os sinais que o pipeline já emite (Seção 3.1) deveriam se correlacionar com o que a própria semântica da ocorrência registrada sugere, mesmo sem qualquer treino supervisionado. Duas hipóteses iniciais foram testadas com um script interno de avaliação: (H1) fotografias com a ocorrência T111 ("Caixa/Tampa Embaçada/Danificada — com leitura", que documenta obstrução visual da caixa de medição apesar de a leitura existir) deveriam apresentar taxa de "leitura não detectada" maior que fotografias com nota normal (NA); (H2) fotografias com a ocorrência L101 ("Leitura Informada Pelo Cliente", aplicada quando o leiturista não conseguiu obter a leitura por si e recorreu à informação do cliente) deveriam apresentar o mesmo padrão. O teste foi então ampliado das duas notas originais para as nove ocorrências mais frequentes da base, cobrindo tanto códigos de semântica visual/física quanto códigos puramente administrativos, para verificar se o sinal discrimina seletivamente ou dispara de forma inespecífica para qualquer ocorrência.</w:t>
+        <w:t>Na ausência do rótulo de aceite/rejeição, testou-se uma hipótese mais fraca, porém verificável com os dados disponíveis: os sinais que o pipeline já emite (Seção 3.1) deveriam se correlacionar com o que a própria semântica da ocorrência registrada sugere, mesmo sem qualquer treino supervisionado. Duas hipóteses iniciais foram testadas com um script interno de avaliação: (H1) fotografias com a ocorrência T111 (“Caixa/Tampa Embaçada/Danificada — com leitura”, que documenta obstrução visual da caixa de medição apesar de a leitura existir) deveriam apresentar taxa de “leitura não detectada” maior que fotografias com nota normal (NA); (H2) fotografias com a ocorrência L101 (“Leitura Informada Pelo Cliente”, aplicada quando o leiturista não conseguiu obter a leitura por si e recorreu à informação do cliente) deveriam apresentar o mesmo padrão. O teste foi então ampliado das duas notas originais para as nove ocorrências mais frequentes da base, cobrindo tanto códigos de semântica visual/física quanto códigos puramente administrativos, para verificar se o sinal discrimina seletivamente ou dispara de forma inespecífica para qualquer ocorrência.</w:t>
       </w:r>
     </w:p>
     <w:p>
@@ -1426,7 +1476,25 @@
           <w:i w:val="0"/>
           <w:sz w:val="24"/>
         </w:rPr>
-        <w:t>O resultado (Tabela 3) confirma as duas hipóteses originais na direção esperada: no grupo NA (n=40), 37,5% das fotografias não tiveram leitura detectada; no grupo T111, a taxa sobe para 57,5%; no grupo L101, para 72,5%, a maior de toda a tabela. Mais revelador, porém, é o comportamento dos códigos administrativos: T181 ("Função Não Existe no Sistema", a nota mais frequente da base) apresenta taxa de "leitura não detectada" de apenas 25,0% — *abaixo* do baseline NA —, e T161/R111/P111 ficam todos próximos ou abaixo do baseline. Isso é evidência contra a hipótese trivial de que qualquer ocorrência registrada correlaciona com dificuldade de leitura: o sinal só se eleva nos códigos cuja semântica é especificamente visual ou física sobre a cena fotografada (T111, L101, M141, B111, L131), não em códigos administrativos/de sistema. Essa seletividade é o resultado mais forte desta seção — um sinal que disparasse para qualquer ocorrência seria inútil como feature de um classificador de coerência; um sinal que discrimina por tipo de ocorrência é um candidato genuíno.</w:t>
+        <w:t xml:space="preserve">O resultado (Tabela 3) confirma as duas hipóteses originais na direção esperada: no grupo NA (n=40), 37,5% das fotografias não tiveram leitura detectada; no grupo T111, a taxa sobe para 57,5%; no grupo L101, para 72,5%, a maior de toda a tabela. Mais revelador, porém, é o comportamento dos códigos administrativos: T181 (“Função Não Existe no Sistema”, a nota mais frequente da base) apresenta taxa de “leitura não detectada” de apenas 25,0% — </w:t>
+      </w:r>
+      <w:r>
+        <w:rPr>
+          <w:rFonts w:ascii="Times New Roman" w:hAnsi="Times New Roman" w:eastAsia="Times New Roman"/>
+          <w:b w:val="0"/>
+          <w:i/>
+          <w:sz w:val="24"/>
+        </w:rPr>
+        <w:t>abaixo</w:t>
+      </w:r>
+      <w:r>
+        <w:rPr>
+          <w:rFonts w:ascii="Times New Roman" w:hAnsi="Times New Roman" w:eastAsia="Times New Roman"/>
+          <w:b w:val="0"/>
+          <w:i w:val="0"/>
+          <w:sz w:val="24"/>
+        </w:rPr>
+        <w:t xml:space="preserve"> do baseline NA —, e T161/R111/P111 ficam todos próximos ou abaixo do baseline. Isso é evidência contra a hipótese trivial de que qualquer ocorrência registrada correlaciona com dificuldade de leitura: o sinal só se eleva nos códigos cuja semântica é especificamente visual ou física sobre a cena fotografada (T111, L101, M141, B111, L131), não em códigos administrativos/de sistema. Essa seletividade é o resultado mais forte desta seção — um sinal que disparasse para qualquer ocorrência seria inútil como feature de um classificador de coerência; um sinal que discrimina por tipo de ocorrência é um candidato genuíno.</w:t>
       </w:r>
     </w:p>
     <w:tbl>
@@ -2143,7 +2211,33 @@
           <w:i w:val="0"/>
           <w:sz w:val="24"/>
         </w:rPr>
-        <w:t>Com a correção, a ilegibilidade diverge entre os grupos de forma semanticamente coerente, e não na mesma direção da taxa de "leitura não detectada": T111 tem a maior taxa de ilegibilidade (22,5%, contra 12,5% no grupo NA), consistente com sua semântica de problema óptico na cena. Já L101, apesar de ter a maior taxa de leitura não detectada, apresenta a *menor* taxa de ilegibilidade (0,0%) de toda a tabela — suas fotografias tendem a ser nítidas, apenas sem um display legível na cena. Essa divergência sugere dois mecanismos de falha distintos: T111 aponta para um problema de qualidade da imagem (borrão, obstrução física), enquanto L101 aponta para um problema de ausência de alvo (medidor não fotografado de frente, inacessível, ou substituído por informação verbal do cliente) que uma métrica de nitidez pura não captura. Um classificador de coerência completo precisará dos dois sinais separadamente, não de um único indicador combinado.</w:t>
+        <w:t xml:space="preserve">Com a correção, a ilegibilidade diverge entre os grupos de forma semanticamente coerente, e não na mesma direção da taxa de “leitura não detectada”: T111 tem a maior taxa de ilegibilidade (22,5%, contra 12,5% no grupo NA), consistente com sua semântica de problema óptico na cena. Já L101, apesar de ter a maior taxa de leitura não detectada, apresenta a </w:t>
+      </w:r>
+      <w:r>
+        <w:rPr>
+          <w:rFonts w:ascii="Times New Roman" w:hAnsi="Times New Roman" w:eastAsia="Times New Roman"/>
+          <w:b w:val="0"/>
+          <w:i/>
+          <w:sz w:val="24"/>
+        </w:rPr>
+        <w:t>menor</w:t>
+      </w:r>
+      <w:r>
+        <w:rPr>
+          <w:rFonts w:ascii="Times New Roman" w:hAnsi="Times New Roman" w:eastAsia="Times New Roman"/>
+          <w:b w:val="0"/>
+          <w:i w:val="0"/>
+          <w:sz w:val="24"/>
+        </w:rPr>
+        <w:t xml:space="preserve"> taxa de ilegibilidade (0,0%) de toda a tabela — suas fotografias tendem a ser nítidas, apenas sem um display legível na cena. Essa divergência sugere dois mecanismos de falha distintos: T111 aponta para um problema de qualidade da imagem (borrão, obstrução física), enquanto L101 aponta para um problema de ausência de alvo (medidor não fotografado de frente, inacessível, ou substituído por informação verbal do cliente) que uma métrica de nitidez pura não captura. Um classificador de coerência completo precisará dos dois sinais separadamente, não de um único indicador combinado.</w:t>
+      </w:r>
+      <w:r>
+        <w:rPr>
+          <w:rFonts w:ascii="Times New Roman" w:hAnsi="Times New Roman" w:eastAsia="Times New Roman"/>
+          <w:b w:val="0"/>
+          <w:sz w:val="24"/>
+        </w:rPr>
+        <w:t xml:space="preserve"> Os valores medidos tornam essa divergência concreta: no grupo T111, os percentis 10/50/90 da variância do Laplaciano são 8,5/87,0/1.444,4, com o percentil 10 abaixo de qualquer limiar razoável de legibilidade; no grupo L101, os mesmos percentis são 460,8/2.755,2/9.312,8 — mais de cinquenta vezes o piso de T111 —, confirmando numericamente que as fotografias desse grupo são nítidas, apenas sem um alvo legível na cena.</w:t>
       </w:r>
     </w:p>
     <w:p>
@@ -2173,7 +2267,25 @@
           <w:i w:val="0"/>
           <w:sz w:val="24"/>
         </w:rPr>
-        <w:t>A divergência da Tabela 3 mostra que a ilegibilidade discrimina entre grupos de ocorrência, mas não prova que ela discrimina corretamente entre foto boa e foto ruim — a base de campo não tem esse rótulo. Buscou-se uma validação independente no único conjunto com gabarito real disponível: o UFPR-AMR (Seção 2.3), comparando a nitidez do recorte com o acerto/erro do reconhecedor PP-OCRv6 no benchmark da Seção 4.1. O resultado foi negativo: a correlação de Pearson entre nitidez e acerto exato foi de -0,002, e um teste de discriminação por pares aleatórios (probabilidade de uma imagem corretamente lida ter nitidez maior que uma incorretamente lida) resultou em 0,426 — abaixo mesmo do acaso (0,5). Ou seja, no domínio onde existe gabarito, a variância do Laplaciano isoladamente **não prediz** se o reconhecedor vai acertar a leitura. Duas explicações não excludentes: os recortes do UFPR-AMR já foram pré-selecionados pelos curadores do dataset (pouca variação de nitidez sobra para discriminar), e os erros do reconhecedor nesse benchmark provavelmente derivam mais de confusão entre dígitos do que de borrão da imagem. Esse resultado reforça a cautela já adotada de não fixar um novo limiar sem rótulo de referência do próprio domínio de aplicação (fotografias de campo, não recortes de display) — a nitidez pode ainda ser útil combinada a outras features, mas não como preditor único.</w:t>
+        <w:t xml:space="preserve">A divergência da Tabela 3 mostra que a ilegibilidade discrimina entre grupos de ocorrência, mas não prova que ela discrimina corretamente entre foto boa e foto ruim — a base de campo não tem esse rótulo. Buscou-se uma validação independente no único conjunto com gabarito real disponível: o UFPR-AMR (Seção 2.3), comparando a nitidez do recorte com o acerto/erro do reconhecedor PP-OCRv6 no benchmark da Seção 4.1. O resultado foi negativo: a correlação de Pearson entre nitidez e acerto exato foi de -0,002, e um teste de discriminação por pares aleatórios (probabilidade de uma imagem corretamente lida ter nitidez maior que uma incorretamente lida) resultou em 0,426 — abaixo mesmo do acaso (0,5). Ou seja, no domínio onde existe gabarito, a variância do Laplaciano isoladamente </w:t>
+      </w:r>
+      <w:r>
+        <w:rPr>
+          <w:rFonts w:ascii="Times New Roman" w:hAnsi="Times New Roman" w:eastAsia="Times New Roman"/>
+          <w:b/>
+          <w:i w:val="0"/>
+          <w:sz w:val="24"/>
+        </w:rPr>
+        <w:t>não prediz</w:t>
+      </w:r>
+      <w:r>
+        <w:rPr>
+          <w:rFonts w:ascii="Times New Roman" w:hAnsi="Times New Roman" w:eastAsia="Times New Roman"/>
+          <w:b w:val="0"/>
+          <w:i w:val="0"/>
+          <w:sz w:val="24"/>
+        </w:rPr>
+        <w:t xml:space="preserve"> se o reconhecedor vai acertar a leitura. Duas explicações não excludentes: os recortes do UFPR-AMR já foram pré-selecionados pelos curadores do dataset (pouca variação de nitidez sobra para discriminar), e os erros do reconhecedor nesse benchmark provavelmente derivam mais de confusão entre dígitos do que de borrão da imagem. Esse resultado reforça a cautela já adotada de não fixar um novo limiar sem rótulo de referência do próprio domínio de aplicação (fotografias de campo, não recortes de display) — a nitidez pode ainda ser útil combinada a outras features, mas não como preditor único.</w:t>
       </w:r>
     </w:p>
     <w:p>
@@ -2203,7 +2315,77 @@
           <w:i w:val="0"/>
           <w:sz w:val="24"/>
         </w:rPr>
-        <w:t>Três limitações de validade merecem destaque. Primeiro, representatividade: os quatro lotes disponíveis não contêm nenhuma ocorrência dos tipos "imóvel fechado" ou "imóvel demolido" (Seção 3.2), que estão entre os cenários mais discutidos na literatura interna do projeto sobre o problema — a caracterização aqui relatada cobre o que a amostra permite, não o espectro completo do catálogo de 61 códigos. Segundo, escala da avaliação de campo: os achados da Seção 4.2 e 4.3 derivam de dezenas a poucas centenas de fotografias, não da base de 12,3 mil imagens em sua totalidade — suficiente para testar hipóteses pontuais, insuficiente para estimar taxas de erro com confiança estatística. Terceiro, custo computacional: mediu-se formalmente a latência de inferência em ambiente de CPU (sem aceleração por GPU) sobre as 382 fotografias das avaliações da Seção 4.3 — média de 4,43 segundos por imagem, mediana de 1,4 segundos, percentil 90 de 13,2 segundos e máximo de 27,3 segundos. A cauda longa corresponde aos casos que acionam a segunda fase de inferência (imagem invertida, Seção 3); a mediana bem abaixo da média indica que a maioria das fotografias é processada rapidamente, com uma minoria de casos difíceis puxando o tempo médio para cima. Esse perfil é adequado a um processamento em lote noturno da fila de validação (382 imagens processadas em pouco mais de 28 minutos), mas inviabilizaria, no estado atual, uma resposta em tempo real durante a visita do leiturista.</w:t>
+        <w:t>Três limitações de validade merecem destaque. Primeiro, representatividade: os quatro lotes disponíveis não contêm nenhuma ocorrência dos tipos “imóvel fechado” ou “imóvel demolido” (Seção 3.2), que estão entre os cenários mais discutidos na literatura interna do projeto sobre o problema — a caracterização aqui relatada cobre o que a amostra permite, não o espectro completo do catálogo de 61 códigos. Segundo, escala da avaliação de campo: os achados da Seção 4.2 e 4.3 derivam de dezenas a poucas centenas de fotografias, não da base de 12,3 mil imagens em sua totalidade — suficiente para testar hipóteses pontuais, insuficiente para estimar taxas de erro com confiança estatística. Terceiro, custo computacional: mediu-se formalmente a latência de inferência em ambiente de CPU (sem aceleração por GPU) sobre as 382 fotografias das avaliações da Seção 4.3 — média de 4,43 segundos por imagem, mediana de 1,4 segundos, percentil 90 de 13,2 segundos e máximo de 27,3 segundos. A cauda longa corresponde aos casos que acionam a segunda fase de inferência (imagem invertida, Seção 3); a mediana bem abaixo da média indica que a maioria das fotografias é processada rapidamente, com uma minoria de casos difíceis puxando o tempo médio para cima. Esse perfil é adequado a um processamento em lote noturno da fila de validação (382 imagens processadas em pouco mais de 28 minutos), mas inviabilizaria, no estado atual, uma resposta em tempo real durante a visita do leiturista.</w:t>
+      </w:r>
+    </w:p>
+    <w:p>
+      <w:pPr>
+        <w:spacing w:after="120" w:line="240" w:lineRule="auto"/>
+        <w:jc w:val="both"/>
+      </w:pPr>
+      <w:r>
+        <w:rPr>
+          <w:rFonts w:ascii="Times New Roman" w:hAnsi="Times New Roman" w:eastAsia="Times New Roman"/>
+          <w:b w:val="0"/>
+          <w:sz w:val="24"/>
+        </w:rPr>
+        <w:t>Quarto, ruído estrutural no próprio conjunto de campo: a Seção 3.2 já identificou que 9,6% dos registros trazem dois números de medidor separados por barra sem explicação estrutural clara, e que 7,5% das linhas cuja ocorrência exige fotografia não têm arquivo associado, concentradas em três códigos. Um piloto de anotação supervisionada (Seção 4.5) herdará esse ruído, o que recomenda uma etapa de triagem e limpeza prévia à anotação — em particular, excluir do primeiro lote os registros com número de medidor ambíguo ou fotografia ausente, para não contaminar o rótulo desde a primeira iteração do classificador.</w:t>
+      </w:r>
+    </w:p>
+    <w:p>
+      <w:pPr>
+        <w:spacing w:after="120" w:line="240" w:lineRule="auto"/>
+        <w:jc w:val="both"/>
+      </w:pPr>
+      <w:r>
+        <w:rPr>
+          <w:rFonts w:ascii="Times New Roman" w:hAnsi="Times New Roman" w:eastAsia="Times New Roman"/>
+          <w:b/>
+          <w:sz w:val="24"/>
+        </w:rPr>
+        <w:t>4.5 Caminho operacional para viabilização do treino supervisionado</w:t>
+      </w:r>
+    </w:p>
+    <w:p>
+      <w:pPr>
+        <w:spacing w:after="120" w:line="240" w:lineRule="auto"/>
+        <w:jc w:val="both"/>
+      </w:pPr>
+      <w:r>
+        <w:rPr>
+          <w:rFonts w:ascii="Times New Roman" w:hAnsi="Times New Roman" w:eastAsia="Times New Roman"/>
+          <w:b w:val="0"/>
+          <w:sz w:val="24"/>
+        </w:rPr>
+        <w:t>Os achados das Seções 4.2 e 4.3 permitem esboçar, com alguma concretude, um caminho para superar a lacuna identificada na Seção 3.2 — a ausência do rótulo de decisão da fiscalização. Em vez de um piloto de anotação abrangendo os 61 códigos do catálogo, a evidência de seletividade da Tabela 3 sugere priorizar, num primeiro lote, os grupos cuja semântica é visual ou física (T111, L101, M141, B111, L131) — exatamente os que apresentaram desvio consistente em relação ao baseline NA — em vez dos códigos administrativos, para os quais o pipeline não tem, a priori, razão para discriminar. Essa priorização reduz o volume de anotação manual necessário para validar a hipótese antes de comprometer recursos com o catálogo completo.</w:t>
+      </w:r>
+    </w:p>
+    <w:p>
+      <w:pPr>
+        <w:spacing w:after="120" w:line="240" w:lineRule="auto"/>
+        <w:jc w:val="both"/>
+      </w:pPr>
+      <w:r>
+        <w:rPr>
+          <w:rFonts w:ascii="Times New Roman" w:hAnsi="Times New Roman" w:eastAsia="Times New Roman"/>
+          <w:b w:val="0"/>
+          <w:sz w:val="24"/>
+        </w:rPr>
+        <w:t>Em termos de escala, um piloto de mil a duas mil fotografias distribuídas entre esses cinco grupos — uma fração pequena da base de 12,3 mil imagens já levantada (Seção 3.2) — seria suficiente para treinar um classificador supervisionado simples sobre os sinais já emitidos pelo pipeline, sem exigir novos ciclos de coleta de dados. Considerando a proporção de seis analistas para o volume mensal estimada na Seção 2.4, um piloto dessa escala representaria uma fração pequena da carga de revisão de um único dia útil — um custo de anotação compatível com validação incremental, e não uma reformulação do processo operacional vigente. O resultado negativo da validação cruzada de nitidez (Seção 4.3.1) reforça, adicionalmente, que esse classificador não deve depender de um único sinal: a combinação de features é o desenho recomendado, não a busca por um substituto único do julgamento humano.</w:t>
+      </w:r>
+    </w:p>
+    <w:p>
+      <w:pPr>
+        <w:spacing w:after="120" w:line="240" w:lineRule="auto"/>
+        <w:jc w:val="both"/>
+      </w:pPr>
+      <w:r>
+        <w:rPr>
+          <w:rFonts w:ascii="Times New Roman" w:hAnsi="Times New Roman" w:eastAsia="Times New Roman"/>
+          <w:b w:val="0"/>
+          <w:sz w:val="24"/>
+        </w:rPr>
+        <w:t>Do ponto de vista de features, o piloto proposto pode reaproveitar diretamente as saídas já produzidas pelo pipeline sem qualquer reengenharia: a variância do Laplaciano como valor contínuo (não mais o booleano herdado do limiar de 25, corrigido na Seção 4.3), o número de leituras candidatas detectadas, a presença ou ausência de número de série, e a similaridade de assinatura do medidor (Seção 3) entre a fotografia analisada e um histórico de fotografias anteriores do mesmo ponto de medição — um sinal ainda não explorado nos testes empíricos das Seções 4.3 e 4.3.1, mas que poderia detectar, por exemplo, uma fotografia enviada para um medidor diferente do esperado na unidade consumidora. Essa é a extensão mais direta do trabalho atual: os componentes já existem no pipeline, restando apenas o rótulo supervisionado para transformá-los em um classificador treinado.</w:t>
       </w:r>
     </w:p>
     <w:p/>
@@ -2251,6 +2433,14 @@
           <w:sz w:val="24"/>
         </w:rPr>
         <w:t>Para a validação de coerência entre fotografia e ocorrência registrada, o trabalho relata o levantamento de uma base real de campo que resolve a lacuna de dados identificada na literatura, mas evidencia que a lacuna remanescente não é de volume de imagens, e sim do rótulo de decisão da fiscalização. Esse é o passo necessário indicado como trabalho futuro, junto ao ajuste fino dos reconhecedores sobre dados de campo e à integração dos sinais de coerência já emitidos pelo pipeline — legibilidade, ausência ou multiplicidade de leituras, ausência de série — como features de um classificador supervisionado. O teste empírico sobre dez grupos de ocorrência (Seção 4.3) indica que esses sinais discriminam seletivamente — respondem a códigos de semântica visual/física, não a qualquer ocorrência — o que reforça a viabilidade do caminho proposto; ao mesmo tempo, a validação cruzada contra o gabarito real do UFPR-AMR (Seção 4.3.1) mostra que a nitidez isolada não é suficiente como preditor, reforçando que o classificador final precisará combinar múltiplos sinais, não apenas um.</w:t>
+      </w:r>
+      <w:r>
+        <w:rPr>
+          <w:rFonts w:ascii="Times New Roman" w:hAnsi="Times New Roman" w:eastAsia="Times New Roman"/>
+          <w:b w:val="0"/>
+          <w:sz w:val="24"/>
+        </w:rPr>
+        <w:t xml:space="preserve"> A Seção 4.5 traduz esses achados em um roteiro operacional concreto — piloto de anotação priorizado pelos grupos de ocorrência com semântica visual/física, em escala compatível com a capacidade de revisão já existente — que reduz a lacuna remanescente a um passo de execução, não a uma questão em aberto sobre a viabilidade da abordagem.</w:t>
       </w:r>
     </w:p>
     <w:p>

</xml_diff>

<commit_message>
docs: destopifica artigo (remove 2.4/4.5 como subsecoes) e quebra paragrafos grandes por ideia
2.4 e 4.5 viram paragrafos correntes sem cabecalho proprio, dentro de Contexto/Resultados.
~25 paragrafos grandes (>120 palavras) quebrados no ponto de mudanca de ideia, preservando
negrito/italico embutido. Legendas "Fonte: elaborado pelos autores" trocadas por versoes
que citam a fonte real (UFPR-AMR, base de campo, Secao 4.3) em vez do boilerplate generico.
</commit_message>
<xml_diff>
--- a/docs/sbti_artigo/artigo_sbti2026.docx
+++ b/docs/sbti_artigo/artigo_sbti2026.docx
@@ -230,7 +230,7 @@
           <w:i w:val="0"/>
           <w:sz w:val="24"/>
         </w:rPr>
-        <w:t>Parte dessas fotografias é sinalizada como potencialmente inconsistente e encaminhada para validação manual. Em operações de grande porte, esse volume varia entre 50 e 70 mil imagens mensais, analisadas por uma equipe reduzida de seis analistas/validadores que verificam, uma a uma, se a evidência apresentada é suficiente e compatível com o registro efetuado em campo. O elevado número de análises aumenta a carga operacional da equipe, contribui para a realização de horas extras e introduz variação de julgamento entre analistas distintos. O problema não se resume à qualidade técnica da imagem — iluminação, desfoque, enquadramento, rotação — mas também à sua coerência com o contexto da visita, o que exige considerar a diversidade de medidores e configurações de medição, incluindo unidades com geração própria de energia.</w:t>
+        <w:t xml:space="preserve">Parte dessas fotografias é sinalizada como potencialmente inconsistente e encaminhada para validação manual. Em operações de grande porte, esse volume varia entre 50 e 70 mil imagens mensais, analisadas por uma equipe reduzida de seis analistas/validadores que verificam, uma a uma, se a evidência apresentada é suficiente e compatível com o registro efetuado em campo. O elevado número de análises aumenta a carga operacional da equipe, contribui para a realização de horas extras e introduz variação de julgamento entre analistas distintos. </w:t>
       </w:r>
     </w:p>
     <w:p>
@@ -245,7 +245,7 @@
           <w:i w:val="0"/>
           <w:sz w:val="24"/>
         </w:rPr>
-        <w:t>A leitura óptica de displays de medidores tem recebido atenção crescente da comunidade de visão computacional, com conjuntos de dados e baselines públicos voltados especificamente a medidores brasileiros, e com o avanço geral de detectores e reconhecedores de texto em cena. Esses trabalhos, no entanto, tratam majoritariamente da tarefa isolada de reconhecer os dígitos em um recorte já centrado no display, e pouco tratam da composição desses componentes em um pipeline que opere sobre a fotografia de campo completa — sujeita a rotação arbitrária, medidores mecânicos com dígitos claros sobre fundo escuro e concorrência com outros textos na cena, como a placa de identificação do medidor. Mais significativamente, a decisão que de fato interessa à fiscalização — se a evidência fotográfica é suficiente e coerente com a ocorrência registrada pelo leiturista — é um problema de classificação de cena e contexto, distinto do reconhecimento de dígitos, para o qual não foi identificado um conjunto de dados público que associe fotografias de campo aos códigos de ocorrência aplicados.</w:t>
+        <w:t xml:space="preserve">O problema não se resume à qualidade técnica da imagem — iluminação, desfoque, enquadramento, rotação — mas também à sua coerência com o contexto da visita, o que exige considerar a diversidade de medidores e configurações de medição, incluindo unidades com geração própria de energia.</w:t>
       </w:r>
     </w:p>
     <w:p>
@@ -260,7 +260,52 @@
           <w:i w:val="0"/>
           <w:sz w:val="24"/>
         </w:rPr>
-        <w:t>Este trabalho tem como objetivo geral avaliar e documentar uma abordagem de visão computacional para tornar a fiscalização de evidências fotográficas de leitura mais eficiente e padronizada, preservando a atuação humana nos casos que exigem julgamento especializado. Especificamente, o trabalho (i) avalia modelos de detecção e reconhecimento de texto prontos, sem ajuste fino, na leitura de displays de medidores em um conjunto de dados público brasileiro; (ii) descreve um conjunto de decisões de engenharia que estendem esses modelos a fotografias de campo, incluindo detecção de orientação, inferência em duas fases para medidores mecânicos com dígitos invertidos e uma assinatura do medidor para reidentificação sem depender de um número de série legível; e (iii) relata o levantamento de uma base real de fotografias de campo, obtida junto a uma distribuidora de energia, que caracteriza o problema de validação de coerência e delimita exatamente o que falta para viabilizar seu treino supervisionado.</w:t>
+        <w:t xml:space="preserve">A leitura óptica de displays de medidores tem recebido atenção crescente da comunidade de visão computacional, com conjuntos de dados e baselines públicos voltados especificamente a medidores brasileiros, e com o avanço geral de detectores e reconhecedores de texto em cena. Esses trabalhos, no entanto, tratam majoritariamente da tarefa isolada de reconhecer os dígitos em um recorte já centrado no display, e pouco tratam da composição desses componentes em um pipeline que opere sobre a fotografia de campo completa — sujeita a rotação arbitrária, medidores mecânicos com dígitos claros sobre fundo escuro e concorrência com outros textos na cena, como a placa de identificação do medidor. </w:t>
+      </w:r>
+    </w:p>
+    <w:p>
+      <w:pPr>
+        <w:spacing w:after="120" w:line="240" w:lineRule="auto"/>
+        <w:jc w:val="both"/>
+      </w:pPr>
+      <w:r>
+        <w:rPr>
+          <w:rFonts w:ascii="Times New Roman" w:hAnsi="Times New Roman"/>
+          <w:b w:val="0"/>
+          <w:i w:val="0"/>
+          <w:sz w:val="24"/>
+        </w:rPr>
+        <w:t xml:space="preserve">Mais significativamente, a decisão que de fato interessa à fiscalização — se a evidência fotográfica é suficiente e coerente com a ocorrência registrada pelo leiturista — é um problema de classificação de cena e contexto, distinto do reconhecimento de dígitos, para o qual não foi identificado um conjunto de dados público que associe fotografias de campo aos códigos de ocorrência aplicados.</w:t>
+      </w:r>
+    </w:p>
+    <w:p>
+      <w:pPr>
+        <w:spacing w:after="120" w:line="240" w:lineRule="auto"/>
+        <w:jc w:val="both"/>
+      </w:pPr>
+      <w:r>
+        <w:rPr>
+          <w:rFonts w:ascii="Times New Roman" w:hAnsi="Times New Roman"/>
+          <w:b w:val="0"/>
+          <w:i w:val="0"/>
+          <w:sz w:val="24"/>
+        </w:rPr>
+        <w:t xml:space="preserve">Este trabalho tem como objetivo geral avaliar e documentar uma abordagem de visão computacional para tornar a fiscalização de evidências fotográficas de leitura mais eficiente e padronizada, preservando a atuação humana nos casos que exigem julgamento especializado. </w:t>
+      </w:r>
+    </w:p>
+    <w:p>
+      <w:pPr>
+        <w:spacing w:after="120" w:line="240" w:lineRule="auto"/>
+        <w:jc w:val="both"/>
+      </w:pPr>
+      <w:r>
+        <w:rPr>
+          <w:rFonts w:ascii="Times New Roman" w:hAnsi="Times New Roman"/>
+          <w:b w:val="0"/>
+          <w:i w:val="0"/>
+          <w:sz w:val="24"/>
+        </w:rPr>
+        <w:t xml:space="preserve">Especificamente, o trabalho (i) avalia modelos de detecção e reconhecimento de texto prontos, sem ajuste fino, na leitura de displays de medidores em um conjunto de dados público brasileiro; (ii) descreve um conjunto de decisões de engenharia que estendem esses modelos a fotografias de campo, incluindo detecção de orientação, inferência em duas fases para medidores mecânicos com dígitos invertidos e uma assinatura do medidor para reidentificação sem depender de um número de série legível; e (iii) relata o levantamento de uma base real de fotografias de campo, obtida junto a uma distribuidora de energia, que caracteriza o problema de validação de coerência e delimita exatamente o que falta para viabilizar seu treino supervisionado.</w:t>
       </w:r>
     </w:p>
     <w:p/>
@@ -322,7 +367,22 @@
           <w:i w:val="0"/>
           <w:sz w:val="24"/>
         </w:rPr>
-        <w:t>Laroca et al. (2020) introduziram o UFPR-AMR, um conjunto de dados com 2.000 imagens de displays de medidores de energia brasileiros, acompanhado de baselines de detecção e reconhecimento — referência mais próxima do domínio de aplicação deste trabalho e utilizada aqui como conjunto de avaliação. Fora do domínio de medidores, duas famílias de modelos de propósito geral sustentam grande parte dos sistemas de OCR aplicados: a família PP-OCR do PaddlePaddle, que combina um detector de texto baseado em binarização diferenciável (Liao et al., 2020) com reconhecedores leves treinados para texto de cena em geral; e o TrOCR (Li et al., 2023), um modelo transformer de reconhecimento de texto impresso e manuscrito pré-treinado em grandes corpora genéricos. Nenhuma dessas famílias foi treinada especificamente para displays de medidores — sua aplicação ao domínio depende de composição com pré-processamento e pós-processamento específicos, o que motiva as decisões de pipeline descritas na Seção 3.</w:t>
+        <w:t xml:space="preserve">Laroca et al. (2020) introduziram o UFPR-AMR, um conjunto de dados com 2.000 imagens de displays de medidores de energia brasileiros, acompanhado de baselines de detecção e reconhecimento — referência mais próxima do domínio de aplicação deste trabalho e utilizada aqui como conjunto de avaliação. Fora do domínio de medidores, duas famílias de modelos de propósito geral sustentam grande parte dos sistemas de OCR aplicados: a família PP-OCR do PaddlePaddle, que combina um detector de texto baseado em binarização diferenciável (Liao et al., 2020) com reconhecedores leves treinados para texto de cena em geral; e o TrOCR (Li et al., 2023), um modelo transformer de reconhecimento de texto impresso e manuscrito pré-treinado em grandes corpora genéricos. </w:t>
+      </w:r>
+    </w:p>
+    <w:p>
+      <w:pPr>
+        <w:spacing w:after="120" w:line="240" w:lineRule="auto"/>
+        <w:jc w:val="both"/>
+      </w:pPr>
+      <w:r>
+        <w:rPr>
+          <w:rFonts w:ascii="Times New Roman" w:hAnsi="Times New Roman"/>
+          <w:b w:val="0"/>
+          <w:i w:val="0"/>
+          <w:sz w:val="24"/>
+        </w:rPr>
+        <w:t xml:space="preserve">Nenhuma dessas famílias foi treinada especificamente para displays de medidores — sua aplicação ao domínio depende de composição com pré-processamento e pós-processamento específicos, o que motiva as decisões de pipeline descritas na Seção 3.</w:t>
       </w:r>
     </w:p>
     <w:p>
@@ -352,7 +412,37 @@
           <w:i w:val="0"/>
           <w:sz w:val="24"/>
         </w:rPr>
-        <w:t>O problema de decidir se uma fotografia constitui evidência suficiente e coerente com uma ocorrência registrada é, em essência, um problema de classificação de cena e contexto: a mesma ausência de leitura no display pode ser esperada (imóvel fechado, demolido) ou indicar uma inconsistência, a depender da ocorrência aplicada. Não foi identificado, na literatura consultada, um conjunto de dados público que associe fotografias de campo de medidores de energia a códigos de ocorrência equivalentes aos utilizados operacionalmente pelas distribuidoras. Três candidatos foram mapeados durante o levantamento deste trabalho — uma base de campo de outra distribuidora brasileira (aproximadamente 12,5 mil fotografias), um conjunto de mostradores de medidores brasileiros de segunda geração (aproximadamente 5 mil imagens) e um conjunto menor indexado no IEEE DataPort (570 imagens) — mas nenhum deles ficou acessível dentro do prazo deste trabalho, por exigirem contato direto com os autores e concessão de licença acadêmica. Essa lacuna é distinta da lacuna de leitura óptica discutida em 2.1: enquanto o reconhecimento de dígitos dispõe de benchmarks públicos consolidados, a validação de coerência carece inteiramente de um conjunto de dados de referência de acesso aberto, o que motiva o levantamento de dados primários relatado na Seção 3.2.</w:t>
+        <w:t xml:space="preserve">O problema de decidir se uma fotografia constitui evidência suficiente e coerente com uma ocorrência registrada é, em essência, um problema de classificação de cena e contexto: a mesma ausência de leitura no display pode ser esperada (imóvel fechado, demolido) ou indicar uma inconsistência, a depender da ocorrência aplicada. Não foi identificado, na literatura consultada, um conjunto de dados público que associe fotografias de campo de medidores de energia a códigos de ocorrência equivalentes aos utilizados operacionalmente pelas distribuidoras. </w:t>
+      </w:r>
+    </w:p>
+    <w:p>
+      <w:pPr>
+        <w:spacing w:after="120" w:line="240" w:lineRule="auto"/>
+        <w:jc w:val="both"/>
+      </w:pPr>
+      <w:r>
+        <w:rPr>
+          <w:rFonts w:ascii="Times New Roman" w:hAnsi="Times New Roman"/>
+          <w:b w:val="0"/>
+          <w:i w:val="0"/>
+          <w:sz w:val="24"/>
+        </w:rPr>
+        <w:t xml:space="preserve">Três candidatos foram mapeados durante o levantamento deste trabalho — uma base de campo de outra distribuidora brasileira (aproximadamente 12,5 mil fotografias), um conjunto de mostradores de medidores brasileiros de segunda geração (aproximadamente 5 mil imagens) e um conjunto menor indexado no IEEE DataPort (570 imagens) — mas nenhum deles ficou acessível dentro do prazo deste trabalho, por exigirem contato direto com os autores e concessão de licença acadêmica. </w:t>
+      </w:r>
+    </w:p>
+    <w:p>
+      <w:pPr>
+        <w:spacing w:after="120" w:line="240" w:lineRule="auto"/>
+        <w:jc w:val="both"/>
+      </w:pPr>
+      <w:r>
+        <w:rPr>
+          <w:rFonts w:ascii="Times New Roman" w:hAnsi="Times New Roman"/>
+          <w:b w:val="0"/>
+          <w:i w:val="0"/>
+          <w:sz w:val="24"/>
+        </w:rPr>
+        <w:t xml:space="preserve">Essa lacuna é distinta da lacuna de leitura óptica discutida em 2.1: enquanto o reconhecimento de dígitos dispõe de benchmarks públicos consolidados, a validação de coerência carece inteiramente de um conjunto de dados de referência de acesso aberto, o que motiva o levantamento de dados primários relatado na Seção 3.2.</w:t>
       </w:r>
       <w:r>
         <w:rPr>
@@ -390,7 +480,7 @@
           <w:i w:val="0"/>
           <w:sz w:val="24"/>
         </w:rPr>
-        <w:t>A avaliação da Tarefa 1 utiliza o particionamento oficial do UFPR-AMR (1.400 imagens de treino, 300 de teste, 300 de validação), com o subconjunto de teste (300 imagens) usado para benchmark; o comprimento médio das leituras é de aproximadamente 4,5 dígitos. Duas métricas são reportadas: exact-match, a fração de imagens cuja leitura predita é idêntica ao rótulo; e digit-acc, a acurácia por dígito, calculada alinhando a predição ao rótulo da direita para a esquerda, o que a torna robusta a variações no comprimento da leitura predita. Por transparência, quando o modelo de decodificação emite tokens separados por espaço (caso do TrOCR com busca em feixe), reportam-se tanto a métrica bruta — que conta o espaço como caractere — quanto a métrica após remoção dos espaços, diretamente comparável aos reconhecedores que não emitem esse separador.</w:t>
+        <w:t xml:space="preserve">A avaliação da Tarefa 1 utiliza o particionamento oficial do UFPR-AMR (1.400 imagens de treino, 300 de teste, 300 de validação), com o subconjunto de teste (300 imagens) usado para benchmark; o comprimento médio das leituras é de aproximadamente 4,5 dígitos. </w:t>
       </w:r>
     </w:p>
     <w:p>
@@ -400,11 +490,12 @@
       </w:pPr>
       <w:r>
         <w:rPr>
-          <w:rFonts w:ascii="Times New Roman" w:hAnsi="Times New Roman" w:eastAsia="Times New Roman"/>
-          <w:b/>
+          <w:rFonts w:ascii="Times New Roman" w:hAnsi="Times New Roman"/>
+          <w:b w:val="0"/>
+          <w:i w:val="0"/>
           <w:sz w:val="24"/>
         </w:rPr>
-        <w:t>2.4 Escopo operacional e delimitação do problema</w:t>
+        <w:t xml:space="preserve">Duas métricas são reportadas: exact-match, a fração de imagens cuja leitura predita é idêntica ao rótulo; e digit-acc, a acurácia por dígito, calculada alinhando a predição ao rótulo da direita para a esquerda, o que a torna robusta a variações no comprimento da leitura predita. Por transparência, quando o modelo de decodificação emite tokens separados por espaço (caso do TrOCR com busca em feixe), reportam-se tanto a métrica bruta — que conta o espaço como caractere — quanto a métrica após remoção dos espaços, diretamente comparável aos reconhecedores que não emitem esse separador.</w:t>
       </w:r>
     </w:p>
     <w:p>
@@ -418,7 +509,21 @@
           <w:b w:val="0"/>
           <w:sz w:val="24"/>
         </w:rPr>
-        <w:t>O problema de fiscalização abordado neste trabalho é delimitado por um recorte operacional específico, que o distingue de atividades correlatas, porém não equivalentes: não integram esse recorte o cálculo tarifário, a manutenção da rede elétrica, a investigação de fraude e a cobrança financeira, ainda que todas dependam indiretamente da confiabilidade da leitura registrada. A validação manual das fotografias sinalizadas é hoje realizada por uma equipe de seis analistas/validadores (Seção 1), responsável pelo volume mensal de 50 a 70 mil imagens potencialmente inconsistentes. Considerando um mês típico de aproximadamente 21 dias úteis, essa proporção corresponde a uma faixa de cerca de 400 a 555 imagens por analista por dia útil — uma ordem de grandeza que ajuda a explicar a sobrecarga operacional e as horas extras mencionadas na Seção 1, e que situa a motivação deste trabalho: não a substituição do julgamento humano, mas a redução seletiva do volume que efetivamente precisa dele. Essa delimitação orienta diretamente o desenho descrito na Seção 3: os sinais de coerência emitidos pelo pipeline (Seção 3.1) foram concebidos como insumos de triagem — candidatos a aprovação automática ou a atenção prioritária —, não como um veredito que substitua a análise manual nos casos de maior incerteza.</w:t>
+        <w:t xml:space="preserve">O problema de fiscalização abordado neste trabalho é delimitado por um recorte operacional específico, que o distingue de atividades correlatas, porém não equivalentes: não integram esse recorte o cálculo tarifário, a manutenção da rede elétrica, a investigação de fraude e a cobrança financeira, ainda que todas dependam indiretamente da confiabilidade da leitura registrada. A validação manual das fotografias sinalizadas é hoje realizada por uma equipe de seis analistas/validadores (Seção 1), responsável pelo volume mensal de 50 a 70 mil imagens potencialmente inconsistentes. Considerando um mês típico de aproximadamente 21 dias úteis, essa proporção corresponde a uma faixa de cerca de 400 a 555 imagens por analista por dia útil — uma ordem de grandeza que ajuda a explicar a sobrecarga operacional e as horas extras mencionadas na Seção 1, e que situa a motivação deste trabalho: não a substituição do julgamento humano, mas a redução seletiva do volume que efetivamente precisa dele. </w:t>
+      </w:r>
+    </w:p>
+    <w:p>
+      <w:pPr>
+        <w:spacing w:after="120" w:line="240" w:lineRule="auto"/>
+        <w:jc w:val="both"/>
+      </w:pPr>
+      <w:r>
+        <w:rPr>
+          <w:rFonts w:ascii="Times New Roman" w:hAnsi="Times New Roman" w:eastAsia="Times New Roman"/>
+          <w:b w:val="0"/>
+          <w:sz w:val="24"/>
+        </w:rPr>
+        <w:t xml:space="preserve">Essa delimitação orienta diretamente o desenho descrito na Seção 3: os sinais de coerência emitidos pelo pipeline (Seção 3.1) foram concebidos como insumos de triagem — candidatos a aprovação automática ou a atenção prioritária —, não como um veredito que substitua a análise manual nos casos de maior incerteza.</w:t>
       </w:r>
     </w:p>
     <w:p/>
@@ -450,7 +555,22 @@
           <w:i w:val="0"/>
           <w:sz w:val="24"/>
         </w:rPr>
-        <w:t>O pipeline proposto, denominado MeterOCR, é composto por quatro etapas sequenciais: detecção de caixas de texto, reconhecimento do conteúdo de cada caixa, classificação de cada trecho reconhecido por campo (leitura ou número de série) e seleção da leitura final. A detecção utiliza o PP-OCRv5_mobile_det (ONNX), com pós-processamento por binarização diferenciável (limiar 0,3; limiar de caixa 0,6; fator de expansão 1,5); como a rede exige dimensões múltiplas de 32 pixels, a imagem de entrada é ajustada por preenchimento, com posterior remapeamento das coordenadas das caixas detectadas para a imagem original. O reconhecimento é realizado prioritariamente pelo TrOCR-small-printed, com contingência para o PP-OCRv6_tiny quando o primeiro retorna resultado vazio — combinação que busca aliar a fidelidade do TrOCR à robustez do PP-OCRv6 em casos degenerados. Cada trecho reconhecido é então classificado como leitura (apenas dígitos, aceitando ponto, vírgula ou espaço como separadores, entre um e oito dígitos) ou como número de série (alfanumérico, de seis a vinte e quatro caracteres, excluindo símbolos típicos de placas de identificação). A leitura final prioriza trechos compostos apenas por dígitos e, entre estes, o de maior número de dígitos, sem concatenar caixas detectadas isoladamente — o que evitaria a formação de leituras espúrias em fotografias de cena completa.</w:t>
+        <w:t xml:space="preserve">O pipeline proposto, denominado MeterOCR, é composto por quatro etapas sequenciais: detecção de caixas de texto, reconhecimento do conteúdo de cada caixa, classificação de cada trecho reconhecido por campo (leitura ou número de série) e seleção da leitura final. A detecção utiliza o PP-OCRv5_mobile_det (ONNX), com pós-processamento por binarização diferenciável (limiar 0,3; limiar de caixa 0,6; fator de expansão 1,5); como a rede exige dimensões múltiplas de 32 pixels, a imagem de entrada é ajustada por preenchimento, com posterior remapeamento das coordenadas das caixas detectadas para a imagem original. </w:t>
+      </w:r>
+    </w:p>
+    <w:p>
+      <w:pPr>
+        <w:spacing w:after="120" w:line="240" w:lineRule="auto"/>
+        <w:jc w:val="both"/>
+      </w:pPr>
+      <w:r>
+        <w:rPr>
+          <w:rFonts w:ascii="Times New Roman" w:hAnsi="Times New Roman"/>
+          <w:b w:val="0"/>
+          <w:i w:val="0"/>
+          <w:sz w:val="24"/>
+        </w:rPr>
+        <w:t xml:space="preserve">O reconhecimento é realizado prioritariamente pelo TrOCR-small-printed, com contingência para o PP-OCRv6_tiny quando o primeiro retorna resultado vazio — combinação que busca aliar a fidelidade do TrOCR à robustez do PP-OCRv6 em casos degenerados. Cada trecho reconhecido é então classificado como leitura (apenas dígitos, aceitando ponto, vírgula ou espaço como separadores, entre um e oito dígitos) ou como número de série (alfanumérico, de seis a vinte e quatro caracteres, excluindo símbolos típicos de placas de identificação). A leitura final prioriza trechos compostos apenas por dígitos e, entre estes, o de maior número de dígitos, sem concatenar caixas detectadas isoladamente — o que evitaria a formação de leituras espúrias em fotografias de cena completa.</w:t>
       </w:r>
     </w:p>
     <w:p>
@@ -984,7 +1104,7 @@
           <w:i w:val="0"/>
           <w:sz w:val="20"/>
         </w:rPr>
-        <w:t>Fonte: elaborado pelos autores (2026).</w:t>
+        <w:t>Fonte: elaborado pelos autores (2026), a partir de base de campo cedida por uma distribuidora de energia.</w:t>
       </w:r>
     </w:p>
     <w:p>
@@ -999,7 +1119,22 @@
           <w:i w:val="0"/>
           <w:sz w:val="24"/>
         </w:rPr>
-        <w:t>A inspeção dessa amostra confirma a diversidade de situações antecipada na literatura, e revela padrões que não eram evidentes a partir da documentação operacional isolada. Do total de linhas com nota normal (NA, leitura obtida sem ocorrência), 79,8% ainda assim têm fotografia associada, indicando que o registro fotográfico não se restringe a casos excepcionais. Cerca de 9,6% dos registros trazem dois números de medidor separados por barra (dois identificadores numéricos de dez dígitos); testada a hipótese óbvia de que isso decorreria de substituição de equipamento, ela não se sustenta — apenas 3,6% desses casos carregam a ocorrência de substituição (P111), enquanto 58% ocorrem em linhas de leitura normal, sugerindo uma causa estrutural ainda não identificada. Por fim, das 3.943 linhas cuja ocorrência exige fotografia, 7,5% não têm arquivo de imagem associado, concentradas em apenas três códigos. Nenhuma dessas inconsistências invalida a base; elas delimitam, ao contrário, o tipo de ruído que um classificador de coerência treinado sobre esses dados precisará tolerar.</w:t>
+        <w:t xml:space="preserve">A inspeção dessa amostra confirma a diversidade de situações antecipada na literatura, e revela padrões que não eram evidentes a partir da documentação operacional isolada. Do total de linhas com nota normal (NA, leitura obtida sem ocorrência), 79,8% ainda assim têm fotografia associada, indicando que o registro fotográfico não se restringe a casos excepcionais. Cerca de 9,6% dos registros trazem dois números de medidor separados por barra (dois identificadores numéricos de dez dígitos); testada a hipótese óbvia de que isso decorreria de substituição de equipamento, ela não se sustenta — apenas 3,6% desses casos carregam a ocorrência de substituição (P111), enquanto 58% ocorrem em linhas de leitura normal, sugerindo uma causa estrutural ainda não identificada. </w:t>
+      </w:r>
+    </w:p>
+    <w:p>
+      <w:pPr>
+        <w:spacing w:after="120" w:line="240" w:lineRule="auto"/>
+        <w:jc w:val="both"/>
+      </w:pPr>
+      <w:r>
+        <w:rPr>
+          <w:rFonts w:ascii="Times New Roman" w:hAnsi="Times New Roman"/>
+          <w:b w:val="0"/>
+          <w:i w:val="0"/>
+          <w:sz w:val="24"/>
+        </w:rPr>
+        <w:t xml:space="preserve">Por fim, das 3.943 linhas cuja ocorrência exige fotografia, 7,5% não têm arquivo de imagem associado, concentradas em apenas três códigos. Nenhuma dessas inconsistências invalida a base; elas delimitam, ao contrário, o tipo de ruído que um classificador de coerência treinado sobre esses dados precisará tolerar.</w:t>
       </w:r>
     </w:p>
     <w:p>
@@ -1044,7 +1179,22 @@
           <w:i w:val="0"/>
           <w:sz w:val="24"/>
         </w:rPr>
-        <w:t>As fotografias de campo utilizadas neste trabalho podem conter, além do medidor, elementos de fachada, portão, numeração predial e, ocasionalmente, pessoas — dados pessoais e de geolocalização implícita no sentido da Lei Geral de Proteção de Dados Pessoais (Lei nº 13.709/2018). O tratamento desses dados neste trabalho seguiu três princípios operacionais: a base bruta permanece em armazenamento local, fora de controle de versão e sem redistribuição; nenhuma fotografia individual é reproduzida neste artigo; e as estatísticas relatadas são agregadas, sem exposição de números de medidor, endereços ou identificadores de cliente. Um fluxo de anonimização (por exemplo, desfoque automático de rostos e placas veiculares porventura capturados) e um termo de uso específico para fins de pesquisa acadêmica são pré-requisitos identificados para qualquer uso da base além da caracterização estatística aqui relatada, e permanecem como pendência a esclarecer junto à distribuidora.</w:t>
+        <w:t xml:space="preserve">As fotografias de campo utilizadas neste trabalho podem conter, além do medidor, elementos de fachada, portão, numeração predial e, ocasionalmente, pessoas — dados pessoais e de geolocalização implícita no sentido da Lei Geral de Proteção de Dados Pessoais (Lei nº 13.709/2018). O tratamento desses dados neste trabalho seguiu três princípios operacionais: a base bruta permanece em armazenamento local, fora de controle de versão e sem redistribuição; nenhuma fotografia individual é reproduzida neste artigo; e as estatísticas relatadas são agregadas, sem exposição de números de medidor, endereços ou identificadores de cliente. </w:t>
+      </w:r>
+    </w:p>
+    <w:p>
+      <w:pPr>
+        <w:spacing w:after="120" w:line="240" w:lineRule="auto"/>
+        <w:jc w:val="both"/>
+      </w:pPr>
+      <w:r>
+        <w:rPr>
+          <w:rFonts w:ascii="Times New Roman" w:hAnsi="Times New Roman"/>
+          <w:b w:val="0"/>
+          <w:i w:val="0"/>
+          <w:sz w:val="24"/>
+        </w:rPr>
+        <w:t xml:space="preserve">Um fluxo de anonimização (por exemplo, desfoque automático de rostos e placas veiculares porventura capturados) e um termo de uso específico para fins de pesquisa acadêmica são pré-requisitos identificados para qualquer uso da base além da caracterização estatística aqui relatada, e permanecem como pendência a esclarecer junto à distribuidora.</w:t>
       </w:r>
     </w:p>
     <w:p/>
@@ -1372,7 +1522,7 @@
           <w:i w:val="0"/>
           <w:sz w:val="20"/>
         </w:rPr>
-        <w:t>Fonte: elaborado pelos autores (2026).</w:t>
+        <w:t>Fonte: elaborado pelos autores (2026), a partir do conjunto de teste do UFPR-AMR (Laroca et al., 2020).</w:t>
       </w:r>
     </w:p>
     <w:p>
@@ -1387,7 +1537,22 @@
           <w:i w:val="0"/>
           <w:sz w:val="24"/>
         </w:rPr>
-        <w:t>O PP-OCRv6_tiny obtém o melhor resultado agregado entre os modelos testados, tanto em leituras exatas quanto em acurácia por dígito, apesar de possuir substancialmente menos parâmetros que o TrOCR. O TrOCR-small-printed, por não ter sido treinado para displays de medidores, tende a fragmentar a leitura em tokens separados por espaço; quando essa fragmentação é desfeita, seu desempenho por dígito se aproxima do PP-OCRv6, mas sua taxa de leituras inteiramente corretas permanece inferior. Esses resultados sugerem que, para a leitura completa do display sem ajuste fino, um reconhecedor leve e especializado em texto de cena tende a generalizar melhor que um modelo de OCR genérico de maior capacidade — achado consistente com a natureza do domínio, em que o vocabulário é restrito a dígitos e a principal fonte de erro é a segmentação de caracteres, não a modelagem de linguagem.</w:t>
+        <w:t xml:space="preserve">O PP-OCRv6_tiny obtém o melhor resultado agregado entre os modelos testados, tanto em leituras exatas quanto em acurácia por dígito, apesar de possuir substancialmente menos parâmetros que o TrOCR. O TrOCR-small-printed, por não ter sido treinado para displays de medidores, tende a fragmentar a leitura em tokens separados por espaço; quando essa fragmentação é desfeita, seu desempenho por dígito se aproxima do PP-OCRv6, mas sua taxa de leituras inteiramente corretas permanece inferior. </w:t>
+      </w:r>
+    </w:p>
+    <w:p>
+      <w:pPr>
+        <w:spacing w:after="120" w:line="240" w:lineRule="auto"/>
+        <w:jc w:val="both"/>
+      </w:pPr>
+      <w:r>
+        <w:rPr>
+          <w:rFonts w:ascii="Times New Roman" w:hAnsi="Times New Roman"/>
+          <w:b w:val="0"/>
+          <w:i w:val="0"/>
+          <w:sz w:val="24"/>
+        </w:rPr>
+        <w:t xml:space="preserve">Esses resultados sugerem que, para a leitura completa do display sem ajuste fino, um reconhecedor leve e especializado em texto de cena tende a generalizar melhor que um modelo de OCR genérico de maior capacidade — achado consistente com a natureza do domínio, em que o vocabulário é restrito a dígitos e a principal fonte de erro é a segmentação de caracteres, não a modelagem de linguagem.</w:t>
       </w:r>
     </w:p>
     <w:p>
@@ -1417,7 +1582,22 @@
           <w:i w:val="0"/>
           <w:sz w:val="24"/>
         </w:rPr>
-        <w:t>A inspeção qualitativa de fotografias de campo (fora do recorte padronizado do UFPR-AMR) indica que a detecção de orientação por fração de área horizontal acertou a orientação correta nos seis casos de teste examinados, incluindo um medidor mecânico cujo display só se torna legível após a inversão descrita na Seção 3. Em um caso específico, um odômetro Landis+Gyr não produz leitura alguma sem a etapa de inversão e produz a leitura correta (41365) quando essa etapa é acionada — evidência direta de que a estratégia de duas fases é necessária, não apenas uma robustez marginal, para esse tipo de medidor. Esses achados são qualitativos e derivam de um conjunto reduzido de fotografias de campo; sua confirmação em escala requer avaliação sistemática sobre uma amostra maior, o que a base descrita na Seção 3.2 poderá viabilizar assim que doada de rótulo de decisão.</w:t>
+        <w:t xml:space="preserve">A inspeção qualitativa de fotografias de campo (fora do recorte padronizado do UFPR-AMR) indica que a detecção de orientação por fração de área horizontal acertou a orientação correta nos seis casos de teste examinados, incluindo um medidor mecânico cujo display só se torna legível após a inversão descrita na Seção 3. Em um caso específico, um odômetro Landis+Gyr não produz leitura alguma sem a etapa de inversão e produz a leitura correta (41365) quando essa etapa é acionada — evidência direta de que a estratégia de duas fases é necessária, não apenas uma robustez marginal, para esse tipo de medidor. </w:t>
+      </w:r>
+    </w:p>
+    <w:p>
+      <w:pPr>
+        <w:spacing w:after="120" w:line="240" w:lineRule="auto"/>
+        <w:jc w:val="both"/>
+      </w:pPr>
+      <w:r>
+        <w:rPr>
+          <w:rFonts w:ascii="Times New Roman" w:hAnsi="Times New Roman"/>
+          <w:b w:val="0"/>
+          <w:i w:val="0"/>
+          <w:sz w:val="24"/>
+        </w:rPr>
+        <w:t xml:space="preserve">Esses achados são qualitativos e derivam de um conjunto reduzido de fotografias de campo; sua confirmação em escala requer avaliação sistemática sobre uma amostra maior, o que a base descrita na Seção 3.2 poderá viabilizar assim que doada de rótulo de decisão.</w:t>
       </w:r>
     </w:p>
     <w:p>
@@ -1431,7 +1611,21 @@
           <w:b w:val="0"/>
           <w:sz w:val="24"/>
         </w:rPr>
-        <w:t>Um achado quantificado, obtido a partir da mesma amostra usada no teste empírico da Seção 4.3, reforça a motivação por trás da assinatura do medidor descrita na Seção 3: em todos os dez grupos de ocorrência avaliados, o sinalizador mais frequente emitido pelo pipeline é “serial não detectado” — presente em 248 das 382 fotografias da amostra (65,0%), com incidência mínima de 47,5% (P111) e máxima de 95,0% (L101). Isso indica que a maioria das fotografias de campo enquadra apenas o display do medidor, sem capturar a placa de identificação ou o número de série — um padrão de enquadramento que qualquer estratégia de reidentificação baseada unicamente em número de série encontraria com frequência alta o suficiente para inviabilizá-la operacionalmente, e que justifica, retrospectivamente, a opção por uma assinatura combinada de tokens (Seção 3) em vez de depender de um único campo estruturado.</w:t>
+        <w:t xml:space="preserve">Um achado quantificado, obtido a partir da mesma amostra usada no teste empírico da Seção 4.3, reforça a motivação por trás da assinatura do medidor descrita na Seção 3: em todos os dez grupos de ocorrência avaliados, o sinalizador mais frequente emitido pelo pipeline é “serial não detectado” — presente em 248 das 382 fotografias da amostra (65,0%), com incidência mínima de 47,5% (P111) e máxima de 95,0% (L101). </w:t>
+      </w:r>
+    </w:p>
+    <w:p>
+      <w:pPr>
+        <w:spacing w:after="120" w:line="240" w:lineRule="auto"/>
+        <w:jc w:val="both"/>
+      </w:pPr>
+      <w:r>
+        <w:rPr>
+          <w:rFonts w:ascii="Times New Roman" w:hAnsi="Times New Roman" w:eastAsia="Times New Roman"/>
+          <w:b w:val="0"/>
+          <w:sz w:val="24"/>
+        </w:rPr>
+        <w:t xml:space="preserve">Isso indica que a maioria das fotografias de campo enquadra apenas o display do medidor, sem capturar a placa de identificação ou o número de série — um padrão de enquadramento que qualquer estratégia de reidentificação baseada unicamente em número de série encontraria com frequência alta o suficiente para inviabilizá-la operacionalmente, e que justifica, retrospectivamente, a opção por uma assinatura combinada de tokens (Seção 3) em vez de depender de um único campo estruturado.</w:t>
       </w:r>
     </w:p>
     <w:p>
@@ -1461,7 +1655,22 @@
           <w:i w:val="0"/>
           <w:sz w:val="24"/>
         </w:rPr>
-        <w:t>Na ausência do rótulo de aceite/rejeição, testou-se uma hipótese mais fraca, porém verificável com os dados disponíveis: os sinais que o pipeline já emite (Seção 3.1) deveriam se correlacionar com o que a própria semântica da ocorrência registrada sugere, mesmo sem qualquer treino supervisionado. Duas hipóteses iniciais foram testadas com um script interno de avaliação: (H1) fotografias com a ocorrência T111 (“Caixa/Tampa Embaçada/Danificada — com leitura”, que documenta obstrução visual da caixa de medição apesar de a leitura existir) deveriam apresentar taxa de “leitura não detectada” maior que fotografias com nota normal (NA); (H2) fotografias com a ocorrência L101 (“Leitura Informada Pelo Cliente”, aplicada quando o leiturista não conseguiu obter a leitura por si e recorreu à informação do cliente) deveriam apresentar o mesmo padrão. O teste foi então ampliado das duas notas originais para as nove ocorrências mais frequentes da base, cobrindo tanto códigos de semântica visual/física quanto códigos puramente administrativos, para verificar se o sinal discrimina seletivamente ou dispara de forma inespecífica para qualquer ocorrência.</w:t>
+        <w:t xml:space="preserve">Na ausência do rótulo de aceite/rejeição, testou-se uma hipótese mais fraca, porém verificável com os dados disponíveis: os sinais que o pipeline já emite (Seção 3.1) deveriam se correlacionar com o que a própria semântica da ocorrência registrada sugere, mesmo sem qualquer treino supervisionado. Duas hipóteses iniciais foram testadas com um script interno de avaliação: (H1) fotografias com a ocorrência T111 (“Caixa/Tampa Embaçada/Danificada — com leitura”, que documenta obstrução visual da caixa de medição apesar de a leitura existir) deveriam apresentar taxa de “leitura não detectada” maior que fotografias com nota normal (NA); (H2) fotografias com a ocorrência L101 (“Leitura Informada Pelo Cliente”, aplicada quando o leiturista não conseguiu obter a leitura por si e recorreu à informação do cliente) deveriam apresentar o mesmo padrão. </w:t>
+      </w:r>
+    </w:p>
+    <w:p>
+      <w:pPr>
+        <w:spacing w:after="120" w:line="240" w:lineRule="auto"/>
+        <w:jc w:val="both"/>
+      </w:pPr>
+      <w:r>
+        <w:rPr>
+          <w:rFonts w:ascii="Times New Roman" w:hAnsi="Times New Roman"/>
+          <w:b w:val="0"/>
+          <w:i w:val="0"/>
+          <w:sz w:val="24"/>
+        </w:rPr>
+        <w:t xml:space="preserve">O teste foi então ampliado das duas notas originais para as nove ocorrências mais frequentes da base, cobrindo tanto códigos de semântica visual/física quanto códigos puramente administrativos, para verificar se o sinal discrimina seletivamente ou dispara de forma inespecífica para qualquer ocorrência.</w:t>
       </w:r>
     </w:p>
     <w:p>
@@ -1494,7 +1703,22 @@
           <w:i w:val="0"/>
           <w:sz w:val="24"/>
         </w:rPr>
-        <w:t xml:space="preserve"> do baseline NA —, e T161/R111/P111 ficam todos próximos ou abaixo do baseline. Isso é evidência contra a hipótese trivial de que qualquer ocorrência registrada correlaciona com dificuldade de leitura: o sinal só se eleva nos códigos cuja semântica é especificamente visual ou física sobre a cena fotografada (T111, L101, M141, B111, L131), não em códigos administrativos/de sistema. Essa seletividade é o resultado mais forte desta seção — um sinal que disparasse para qualquer ocorrência seria inútil como feature de um classificador de coerência; um sinal que discrimina por tipo de ocorrência é um candidato genuíno.</w:t>
+        <w:t xml:space="preserve"> do baseline NA —, e T161/R111/P111 ficam todos próximos ou abaixo do baseline. </w:t>
+      </w:r>
+    </w:p>
+    <w:p>
+      <w:pPr>
+        <w:spacing w:after="120" w:line="240" w:lineRule="auto"/>
+        <w:jc w:val="both"/>
+      </w:pPr>
+      <w:r>
+        <w:rPr>
+          <w:rFonts w:ascii="Times New Roman" w:hAnsi="Times New Roman" w:eastAsia="Times New Roman"/>
+          <w:b w:val="0"/>
+          <w:i w:val="0"/>
+          <w:sz w:val="24"/>
+        </w:rPr>
+        <w:t xml:space="preserve">Isso é evidência contra a hipótese trivial de que qualquer ocorrência registrada correlaciona com dificuldade de leitura: o sinal só se eleva nos códigos cuja semântica é especificamente visual ou física sobre a cena fotografada (T111, L101, M141, B111, L131), não em códigos administrativos/de sistema. Essa seletividade é o resultado mais forte desta seção — um sinal que disparasse para qualquer ocorrência seria inútil como feature de um classificador de coerência; um sinal que discrimina por tipo de ocorrência é um candidato genuíno.</w:t>
       </w:r>
     </w:p>
     <w:tbl>
@@ -2181,7 +2405,7 @@
           <w:i w:val="0"/>
           <w:sz w:val="20"/>
         </w:rPr>
-        <w:t>Fonte: elaborado pelos autores (2026).</w:t>
+        <w:t>Fonte: elaborado pelos autores (2026), a partir do teste empírico descrito na Seção 4.3.</w:t>
       </w:r>
     </w:p>
     <w:p>
@@ -2229,7 +2453,22 @@
           <w:i w:val="0"/>
           <w:sz w:val="24"/>
         </w:rPr>
-        <w:t xml:space="preserve"> taxa de ilegibilidade (0,0%) de toda a tabela — suas fotografias tendem a ser nítidas, apenas sem um display legível na cena. Essa divergência sugere dois mecanismos de falha distintos: T111 aponta para um problema de qualidade da imagem (borrão, obstrução física), enquanto L101 aponta para um problema de ausência de alvo (medidor não fotografado de frente, inacessível, ou substituído por informação verbal do cliente) que uma métrica de nitidez pura não captura. Um classificador de coerência completo precisará dos dois sinais separadamente, não de um único indicador combinado.</w:t>
+        <w:t xml:space="preserve"> taxa de ilegibilidade (0,0%) de toda a tabela — suas fotografias tendem a ser nítidas, apenas sem um display legível na cena. </w:t>
+      </w:r>
+    </w:p>
+    <w:p>
+      <w:pPr>
+        <w:spacing w:after="120" w:line="240" w:lineRule="auto"/>
+        <w:jc w:val="both"/>
+      </w:pPr>
+      <w:r>
+        <w:rPr>
+          <w:rFonts w:ascii="Times New Roman" w:hAnsi="Times New Roman" w:eastAsia="Times New Roman"/>
+          <w:b w:val="0"/>
+          <w:i w:val="0"/>
+          <w:sz w:val="24"/>
+        </w:rPr>
+        <w:t xml:space="preserve">Essa divergência sugere dois mecanismos de falha distintos: T111 aponta para um problema de qualidade da imagem (borrão, obstrução física), enquanto L101 aponta para um problema de ausência de alvo (medidor não fotografado de frente, inacessível, ou substituído por informação verbal do cliente) que uma métrica de nitidez pura não captura. Um classificador de coerência completo precisará dos dois sinais separadamente, não de um único indicador combinado.</w:t>
       </w:r>
       <w:r>
         <w:rPr>
@@ -2237,7 +2476,21 @@
           <w:b w:val="0"/>
           <w:sz w:val="24"/>
         </w:rPr>
-        <w:t xml:space="preserve"> Os valores medidos tornam essa divergência concreta: no grupo T111, os percentis 10/50/90 da variância do Laplaciano são 8,5/87,0/1.444,4, com o percentil 10 abaixo de qualquer limiar razoável de legibilidade; no grupo L101, os mesmos percentis são 460,8/2.755,2/9.312,8 — mais de cinquenta vezes o piso de T111 —, confirmando numericamente que as fotografias desse grupo são nítidas, apenas sem um alvo legível na cena.</w:t>
+        <w:t xml:space="preserve"> </w:t>
+      </w:r>
+    </w:p>
+    <w:p>
+      <w:pPr>
+        <w:spacing w:after="120" w:line="240" w:lineRule="auto"/>
+        <w:jc w:val="both"/>
+      </w:pPr>
+      <w:r>
+        <w:rPr>
+          <w:rFonts w:ascii="Times New Roman" w:hAnsi="Times New Roman" w:eastAsia="Times New Roman"/>
+          <w:b w:val="0"/>
+          <w:sz w:val="24"/>
+        </w:rPr>
+        <w:t xml:space="preserve">Os valores medidos tornam essa divergência concreta: no grupo T111, os percentis 10/50/90 da variância do Laplaciano são 8,5/87,0/1.444,4, com o percentil 10 abaixo de qualquer limiar razoável de legibilidade; no grupo L101, os mesmos percentis são 460,8/2.755,2/9.312,8 — mais de cinquenta vezes o piso de T111 —, confirmando numericamente que as fotografias desse grupo são nítidas, apenas sem um alvo legível na cena.</w:t>
       </w:r>
     </w:p>
     <w:p>
@@ -2267,7 +2520,22 @@
           <w:i w:val="0"/>
           <w:sz w:val="24"/>
         </w:rPr>
-        <w:t xml:space="preserve">A divergência da Tabela 3 mostra que a ilegibilidade discrimina entre grupos de ocorrência, mas não prova que ela discrimina corretamente entre foto boa e foto ruim — a base de campo não tem esse rótulo. Buscou-se uma validação independente no único conjunto com gabarito real disponível: o UFPR-AMR (Seção 2.3), comparando a nitidez do recorte com o acerto/erro do reconhecedor PP-OCRv6 no benchmark da Seção 4.1. O resultado foi negativo: a correlação de Pearson entre nitidez e acerto exato foi de -0,002, e um teste de discriminação por pares aleatórios (probabilidade de uma imagem corretamente lida ter nitidez maior que uma incorretamente lida) resultou em 0,426 — abaixo mesmo do acaso (0,5). Ou seja, no domínio onde existe gabarito, a variância do Laplaciano isoladamente </w:t>
+        <w:t xml:space="preserve">A divergência da Tabela 3 mostra que a ilegibilidade discrimina entre grupos de ocorrência, mas não prova que ela discrimina corretamente entre foto boa e foto ruim — a base de campo não tem esse rótulo. Buscou-se uma validação independente no único conjunto com gabarito real disponível: o UFPR-AMR (Seção 2.3), comparando a nitidez do recorte com o acerto/erro do reconhecedor PP-OCRv6 no benchmark da Seção 4.1. </w:t>
+      </w:r>
+    </w:p>
+    <w:p>
+      <w:pPr>
+        <w:spacing w:after="120" w:line="240" w:lineRule="auto"/>
+        <w:jc w:val="both"/>
+      </w:pPr>
+      <w:r>
+        <w:rPr>
+          <w:rFonts w:ascii="Times New Roman" w:hAnsi="Times New Roman"/>
+          <w:b w:val="0"/>
+          <w:i w:val="0"/>
+          <w:sz w:val="24"/>
+        </w:rPr>
+        <w:t xml:space="preserve">O resultado foi negativo: a correlação de Pearson entre nitidez e acerto exato foi de -0,002, e um teste de discriminação por pares aleatórios (probabilidade de uma imagem corretamente lida ter nitidez maior que uma incorretamente lida) resultou em 0,426 — abaixo mesmo do acaso (0,5). Ou seja, no domínio onde existe gabarito, a variância do Laplaciano isoladamente </w:t>
       </w:r>
       <w:r>
         <w:rPr>
@@ -2285,7 +2553,22 @@
           <w:i w:val="0"/>
           <w:sz w:val="24"/>
         </w:rPr>
-        <w:t xml:space="preserve"> se o reconhecedor vai acertar a leitura. Duas explicações não excludentes: os recortes do UFPR-AMR já foram pré-selecionados pelos curadores do dataset (pouca variação de nitidez sobra para discriminar), e os erros do reconhecedor nesse benchmark provavelmente derivam mais de confusão entre dígitos do que de borrão da imagem. Esse resultado reforça a cautela já adotada de não fixar um novo limiar sem rótulo de referência do próprio domínio de aplicação (fotografias de campo, não recortes de display) — a nitidez pode ainda ser útil combinada a outras features, mas não como preditor único.</w:t>
+        <w:t xml:space="preserve"> se o reconhecedor vai acertar a leitura. Duas explicações não excludentes: os recortes do UFPR-AMR já foram pré-selecionados pelos curadores do dataset (pouca variação de nitidez sobra para discriminar), e os erros do reconhecedor nesse benchmark provavelmente derivam mais de confusão entre dígitos do que de borrão da imagem. </w:t>
+      </w:r>
+    </w:p>
+    <w:p>
+      <w:pPr>
+        <w:spacing w:after="120" w:line="240" w:lineRule="auto"/>
+        <w:jc w:val="both"/>
+      </w:pPr>
+      <w:r>
+        <w:rPr>
+          <w:rFonts w:ascii="Times New Roman" w:hAnsi="Times New Roman" w:eastAsia="Times New Roman"/>
+          <w:b w:val="0"/>
+          <w:i w:val="0"/>
+          <w:sz w:val="24"/>
+        </w:rPr>
+        <w:t xml:space="preserve">Esse resultado reforça a cautela já adotada de não fixar um novo limiar sem rótulo de referência do próprio domínio de aplicação (fotografias de campo, não recortes de display) — a nitidez pode ainda ser útil combinada a outras features, mas não como preditor único.</w:t>
       </w:r>
     </w:p>
     <w:p>
@@ -2315,7 +2598,52 @@
           <w:i w:val="0"/>
           <w:sz w:val="24"/>
         </w:rPr>
-        <w:t>Três limitações de validade merecem destaque. Primeiro, representatividade: os quatro lotes disponíveis não contêm nenhuma ocorrência dos tipos “imóvel fechado” ou “imóvel demolido” (Seção 3.2), que estão entre os cenários mais discutidos na literatura interna do projeto sobre o problema — a caracterização aqui relatada cobre o que a amostra permite, não o espectro completo do catálogo de 61 códigos. Segundo, escala da avaliação de campo: os achados da Seção 4.2 e 4.3 derivam de dezenas a poucas centenas de fotografias, não da base de 12,3 mil imagens em sua totalidade — suficiente para testar hipóteses pontuais, insuficiente para estimar taxas de erro com confiança estatística. Terceiro, custo computacional: mediu-se formalmente a latência de inferência em ambiente de CPU (sem aceleração por GPU) sobre as 382 fotografias das avaliações da Seção 4.3 — média de 4,43 segundos por imagem, mediana de 1,4 segundos, percentil 90 de 13,2 segundos e máximo de 27,3 segundos. A cauda longa corresponde aos casos que acionam a segunda fase de inferência (imagem invertida, Seção 3); a mediana bem abaixo da média indica que a maioria das fotografias é processada rapidamente, com uma minoria de casos difíceis puxando o tempo médio para cima. Esse perfil é adequado a um processamento em lote noturno da fila de validação (382 imagens processadas em pouco mais de 28 minutos), mas inviabilizaria, no estado atual, uma resposta em tempo real durante a visita do leiturista.</w:t>
+        <w:t xml:space="preserve">Três limitações de validade merecem destaque. Primeiro, representatividade: os quatro lotes disponíveis não contêm nenhuma ocorrência dos tipos “imóvel fechado” ou “imóvel demolido” (Seção 3.2), que estão entre os cenários mais discutidos na literatura interna do projeto sobre o problema — a caracterização aqui relatada cobre o que a amostra permite, não o espectro completo do catálogo de 61 códigos. </w:t>
+      </w:r>
+    </w:p>
+    <w:p>
+      <w:pPr>
+        <w:spacing w:after="120" w:line="240" w:lineRule="auto"/>
+        <w:jc w:val="both"/>
+      </w:pPr>
+      <w:r>
+        <w:rPr>
+          <w:rFonts w:ascii="Times New Roman" w:hAnsi="Times New Roman"/>
+          <w:b w:val="0"/>
+          <w:i w:val="0"/>
+          <w:sz w:val="24"/>
+        </w:rPr>
+        <w:t xml:space="preserve">Segundo, escala da avaliação de campo: os achados da Seção 4.2 e 4.3 derivam de dezenas a poucas centenas de fotografias, não da base de 12,3 mil imagens em sua totalidade — suficiente para testar hipóteses pontuais, insuficiente para estimar taxas de erro com confiança estatística. </w:t>
+      </w:r>
+    </w:p>
+    <w:p>
+      <w:pPr>
+        <w:spacing w:after="120" w:line="240" w:lineRule="auto"/>
+        <w:jc w:val="both"/>
+      </w:pPr>
+      <w:r>
+        <w:rPr>
+          <w:rFonts w:ascii="Times New Roman" w:hAnsi="Times New Roman"/>
+          <w:b w:val="0"/>
+          <w:i w:val="0"/>
+          <w:sz w:val="24"/>
+        </w:rPr>
+        <w:t xml:space="preserve">Terceiro, custo computacional: mediu-se formalmente a latência de inferência em ambiente de CPU (sem aceleração por GPU) sobre as 382 fotografias das avaliações da Seção 4.3 — média de 4,43 segundos por imagem, mediana de 1,4 segundos, percentil 90 de 13,2 segundos e máximo de 27,3 segundos. </w:t>
+      </w:r>
+    </w:p>
+    <w:p>
+      <w:pPr>
+        <w:spacing w:after="120" w:line="240" w:lineRule="auto"/>
+        <w:jc w:val="both"/>
+      </w:pPr>
+      <w:r>
+        <w:rPr>
+          <w:rFonts w:ascii="Times New Roman" w:hAnsi="Times New Roman"/>
+          <w:b w:val="0"/>
+          <w:i w:val="0"/>
+          <w:sz w:val="24"/>
+        </w:rPr>
+        <w:t xml:space="preserve">A cauda longa corresponde aos casos que acionam a segunda fase de inferência (imagem invertida, Seção 3); a mediana bem abaixo da média indica que a maioria das fotografias é processada rapidamente, com uma minoria de casos difíceis puxando o tempo médio para cima. Esse perfil é adequado a um processamento em lote noturno da fila de validação (382 imagens processadas em pouco mais de 28 minutos), mas inviabilizaria, no estado atual, uma resposta em tempo real durante a visita do leiturista.</w:t>
       </w:r>
     </w:p>
     <w:p>
@@ -2330,20 +2658,6 @@
           <w:sz w:val="24"/>
         </w:rPr>
         <w:t>Quarto, ruído estrutural no próprio conjunto de campo: a Seção 3.2 já identificou que 9,6% dos registros trazem dois números de medidor separados por barra sem explicação estrutural clara, e que 7,5% das linhas cuja ocorrência exige fotografia não têm arquivo associado, concentradas em três códigos. Um piloto de anotação supervisionada (Seção 4.5) herdará esse ruído, o que recomenda uma etapa de triagem e limpeza prévia à anotação — em particular, excluir do primeiro lote os registros com número de medidor ambíguo ou fotografia ausente, para não contaminar o rótulo desde a primeira iteração do classificador.</w:t>
-      </w:r>
-    </w:p>
-    <w:p>
-      <w:pPr>
-        <w:spacing w:after="120" w:line="240" w:lineRule="auto"/>
-        <w:jc w:val="both"/>
-      </w:pPr>
-      <w:r>
-        <w:rPr>
-          <w:rFonts w:ascii="Times New Roman" w:hAnsi="Times New Roman" w:eastAsia="Times New Roman"/>
-          <w:b/>
-          <w:sz w:val="24"/>
-        </w:rPr>
-        <w:t>4.5 Caminho operacional para viabilização do treino supervisionado</w:t>
       </w:r>
     </w:p>
     <w:p>
@@ -2371,7 +2685,7 @@
           <w:b w:val="0"/>
           <w:sz w:val="24"/>
         </w:rPr>
-        <w:t>Em termos de escala, um piloto de mil a duas mil fotografias distribuídas entre esses cinco grupos — uma fração pequena da base de 12,3 mil imagens já levantada (Seção 3.2) — seria suficiente para treinar um classificador supervisionado simples sobre os sinais já emitidos pelo pipeline, sem exigir novos ciclos de coleta de dados. Considerando a proporção de seis analistas para o volume mensal estimada na Seção 2.4, um piloto dessa escala representaria uma fração pequena da carga de revisão de um único dia útil — um custo de anotação compatível com validação incremental, e não uma reformulação do processo operacional vigente. O resultado negativo da validação cruzada de nitidez (Seção 4.3.1) reforça, adicionalmente, que esse classificador não deve depender de um único sinal: a combinação de features é o desenho recomendado, não a busca por um substituto único do julgamento humano.</w:t>
+        <w:t xml:space="preserve">Em termos de escala, um piloto de mil a duas mil fotografias distribuídas entre esses cinco grupos — uma fração pequena da base de 12,3 mil imagens já levantada (Seção 3.2) — seria suficiente para treinar um classificador supervisionado simples sobre os sinais já emitidos pelo pipeline, sem exigir novos ciclos de coleta de dados. </w:t>
       </w:r>
     </w:p>
     <w:p>
@@ -2385,7 +2699,35 @@
           <w:b w:val="0"/>
           <w:sz w:val="24"/>
         </w:rPr>
-        <w:t>Do ponto de vista de features, o piloto proposto pode reaproveitar diretamente as saídas já produzidas pelo pipeline sem qualquer reengenharia: a variância do Laplaciano como valor contínuo (não mais o booleano herdado do limiar de 25, corrigido na Seção 4.3), o número de leituras candidatas detectadas, a presença ou ausência de número de série, e a similaridade de assinatura do medidor (Seção 3) entre a fotografia analisada e um histórico de fotografias anteriores do mesmo ponto de medição — um sinal ainda não explorado nos testes empíricos das Seções 4.3 e 4.3.1, mas que poderia detectar, por exemplo, uma fotografia enviada para um medidor diferente do esperado na unidade consumidora. Essa é a extensão mais direta do trabalho atual: os componentes já existem no pipeline, restando apenas o rótulo supervisionado para transformá-los em um classificador treinado.</w:t>
+        <w:t xml:space="preserve">Considerando a proporção de seis analistas para o volume mensal estimada na Seção 2.4, um piloto dessa escala representaria uma fração pequena da carga de revisão de um único dia útil — um custo de anotação compatível com validação incremental, e não uma reformulação do processo operacional vigente. O resultado negativo da validação cruzada de nitidez (Seção 4.3.1) reforça, adicionalmente, que esse classificador não deve depender de um único sinal: a combinação de features é o desenho recomendado, não a busca por um substituto único do julgamento humano.</w:t>
+      </w:r>
+    </w:p>
+    <w:p>
+      <w:pPr>
+        <w:spacing w:after="120" w:line="240" w:lineRule="auto"/>
+        <w:jc w:val="both"/>
+      </w:pPr>
+      <w:r>
+        <w:rPr>
+          <w:rFonts w:ascii="Times New Roman" w:hAnsi="Times New Roman" w:eastAsia="Times New Roman"/>
+          <w:b w:val="0"/>
+          <w:sz w:val="24"/>
+        </w:rPr>
+        <w:t xml:space="preserve">Do ponto de vista de features, o piloto proposto pode reaproveitar diretamente as saídas já produzidas pelo pipeline sem qualquer reengenharia: a variância do Laplaciano como valor contínuo (não mais o booleano herdado do limiar de 25, corrigido na Seção 4.3), o número de leituras candidatas detectadas, a presença ou ausência de número de série, e a similaridade de assinatura do medidor (Seção 3) entre a fotografia analisada e um histórico de fotografias anteriores do mesmo ponto de medição — um sinal ainda não explorado nos testes empíricos das Seções 4.3 e 4.3.1, mas que poderia detectar, por exemplo, uma fotografia enviada para um medidor diferente do esperado na unidade consumidora. </w:t>
+      </w:r>
+    </w:p>
+    <w:p>
+      <w:pPr>
+        <w:spacing w:after="120" w:line="240" w:lineRule="auto"/>
+        <w:jc w:val="both"/>
+      </w:pPr>
+      <w:r>
+        <w:rPr>
+          <w:rFonts w:ascii="Times New Roman" w:hAnsi="Times New Roman" w:eastAsia="Times New Roman"/>
+          <w:b w:val="0"/>
+          <w:sz w:val="24"/>
+        </w:rPr>
+        <w:t xml:space="preserve">Essa é a extensão mais direta do trabalho atual: os componentes já existem no pipeline, restando apenas o rótulo supervisionado para transformá-los em um classificador treinado.</w:t>
       </w:r>
     </w:p>
     <w:p/>
@@ -2432,7 +2774,22 @@
           <w:i w:val="0"/>
           <w:sz w:val="24"/>
         </w:rPr>
-        <w:t>Para a validação de coerência entre fotografia e ocorrência registrada, o trabalho relata o levantamento de uma base real de campo que resolve a lacuna de dados identificada na literatura, mas evidencia que a lacuna remanescente não é de volume de imagens, e sim do rótulo de decisão da fiscalização. Esse é o passo necessário indicado como trabalho futuro, junto ao ajuste fino dos reconhecedores sobre dados de campo e à integração dos sinais de coerência já emitidos pelo pipeline — legibilidade, ausência ou multiplicidade de leituras, ausência de série — como features de um classificador supervisionado. O teste empírico sobre dez grupos de ocorrência (Seção 4.3) indica que esses sinais discriminam seletivamente — respondem a códigos de semântica visual/física, não a qualquer ocorrência — o que reforça a viabilidade do caminho proposto; ao mesmo tempo, a validação cruzada contra o gabarito real do UFPR-AMR (Seção 4.3.1) mostra que a nitidez isolada não é suficiente como preditor, reforçando que o classificador final precisará combinar múltiplos sinais, não apenas um.</w:t>
+        <w:t xml:space="preserve">Para a validação de coerência entre fotografia e ocorrência registrada, o trabalho relata o levantamento de uma base real de campo que resolve a lacuna de dados identificada na literatura, mas evidencia que a lacuna remanescente não é de volume de imagens, e sim do rótulo de decisão da fiscalização. Esse é o passo necessário indicado como trabalho futuro, junto ao ajuste fino dos reconhecedores sobre dados de campo e à integração dos sinais de coerência já emitidos pelo pipeline — legibilidade, ausência ou multiplicidade de leituras, ausência de série — como features de um classificador supervisionado. </w:t>
+      </w:r>
+    </w:p>
+    <w:p>
+      <w:pPr>
+        <w:spacing w:after="120" w:line="240" w:lineRule="auto"/>
+        <w:jc w:val="both"/>
+      </w:pPr>
+      <w:r>
+        <w:rPr>
+          <w:rFonts w:ascii="Times New Roman" w:hAnsi="Times New Roman"/>
+          <w:b w:val="0"/>
+          <w:i w:val="0"/>
+          <w:sz w:val="24"/>
+        </w:rPr>
+        <w:t xml:space="preserve">O teste empírico sobre dez grupos de ocorrência (Seção 4.3) indica que esses sinais discriminam seletivamente — respondem a códigos de semântica visual/física, não a qualquer ocorrência — o que reforça a viabilidade do caminho proposto; ao mesmo tempo, a validação cruzada contra o gabarito real do UFPR-AMR (Seção 4.3.1) mostra que a nitidez isolada não é suficiente como preditor, reforçando que o classificador final precisará combinar múltiplos sinais, não apenas um.</w:t>
       </w:r>
       <w:r>
         <w:rPr>

</xml_diff>